<commit_message>
EPK /yachts_ny: 3 groups, ski audience moved to separate EPK, no retargeting
Co-authored-by: Igor-Lark <Igor-Lark@users.noreply.github.com>
</commit_message>
<xml_diff>
--- a/reklama/EPK_yachts_ny_NG2027_zima.docx
+++ b/reklama/EPK_yachts_ny_NG2027_zima.docx
@@ -25,7 +25,7 @@
           <w:b w:val="0"/>
           <w:i/>
         </w:rPr>
-        <w:t>Подготовлено 29.10.2026. Документ — настройки для ручной заливки. В Директе ничего не создано и не изменено.</w:t>
+        <w:t>Подготовлено 29.10.2026, обновлено 30.10.2026 (3 группы, без лыжников и ретаргетинга). Документ — настройки для ручной заливки. В Директе ничего не создано и не изменено.</w:t>
       </w:r>
     </w:p>
     <w:p>
@@ -57,7 +57,7 @@
         <w:pStyle w:val="ListBullet"/>
       </w:pPr>
       <w:r>
-        <w:t>5 групп по аудиториям: туристы, планирующие НГ в Сочи; лыжники Красной Поляны; гости Сириуса/Имеретинки; прогулка под парусом 1 800 ₽ (опционально); ретаргетинг посетителей сайта.</w:t>
+        <w:t>3 группы по аудиториям: туристы, планирующие НГ в Сочи; гости Сириуса/Имеретинки; прогулка под парусом 1 800 ₽.</w:t>
       </w:r>
     </w:p>
     <w:p>
@@ -65,7 +65,23 @@
         <w:pStyle w:val="ListBullet"/>
       </w:pPr>
       <w:r>
-        <w:t>Период: запуск 01.11.2026 → активная фаза до 10.01.2027 → зима 11.01–28.02.2027 (нужна правка посадочной, см. раздел 9).</w:t>
+        <w:t>Лыжники и сноубордисты Красной Поляны — НЕ в этой кампании: под них отдельная ЕПК с отдельной посадочной. Здесь их отсекаем минус-фразами (раздел 1.3), чтобы кампании не конкурировали.</w:t>
+      </w:r>
+    </w:p>
+    <w:p>
+      <w:pPr>
+        <w:pStyle w:val="ListBullet"/>
+      </w:pPr>
+      <w:r>
+        <w:t>Ретаргетинга нет: ни отдельной группы, ни офферного ретаргетинга.</w:t>
+      </w:r>
+    </w:p>
+    <w:p>
+      <w:pPr>
+        <w:pStyle w:val="ListBullet"/>
+      </w:pPr>
+      <w:r>
+        <w:t>Период: запуск 01.11.2026 → активная фаза до 10.01.2027 → зима 11.01–28.02.2027 (нужна правка посадочной, см. раздел 7).</w:t>
       </w:r>
     </w:p>
     <w:p>
@@ -261,7 +277,7 @@
           </w:tcPr>
           <w:p>
             <w:r>
-              <w:t>С 11.01 — смена текстов и ссылки (раздел 9)</w:t>
+              <w:t>С 11.01 — смена текстов и ссылки (раздел 7)</w:t>
             </w:r>
           </w:p>
         </w:tc>
@@ -1474,10 +1490,52 @@
     <w:p>
       <w:r>
         <w:rPr>
+          <w:b/>
+          <w:i w:val="0"/>
+        </w:rPr>
+        <w:t>Отсечка лыжной аудитории (её ведёт отдельная ЕПК):</w:t>
+      </w:r>
+    </w:p>
+    <w:p>
+      <w:r>
+        <w:rPr>
+          <w:rFonts w:ascii="Consolas" w:hAnsi="Consolas"/>
+          <w:sz w:val="19"/>
+        </w:rPr>
+        <w:t>-лыжи</w:t>
+        <w:br/>
+        <w:t>-лыжник</w:t>
+        <w:br/>
+        <w:t>-сноуборд</w:t>
+        <w:br/>
+        <w:t>-горнолыжн</w:t>
+        <w:br/>
+        <w:t>-ски пасс</w:t>
+        <w:br/>
+        <w:t>-скипасс</w:t>
+        <w:br/>
+        <w:t>-подъемник</w:t>
+        <w:br/>
+        <w:t>-трассы</w:t>
+        <w:br/>
+        <w:t>-прокат лыж</w:t>
+        <w:br/>
+        <w:t>-роза хутор</w:t>
+        <w:br/>
+        <w:t>-газпром лаура</w:t>
+        <w:br/>
+        <w:t>-альпика</w:t>
+        <w:br/>
+        <w:t>-горки город</w:t>
+      </w:r>
+    </w:p>
+    <w:p>
+      <w:r>
+        <w:rPr>
           <w:b w:val="0"/>
           <w:i/>
         </w:rPr>
-        <w:t>Почему так: рыбалка и Tigger идут отдельными кампаниями; «яхт клуб», «теплоход», «круиз» в соседних кампаниях давали мусорный трафик.</w:t>
+        <w:t xml:space="preserve">Почему так: рыбалка и Tigger идут отдельными кампаниями; «яхт клуб», «теплоход», «круиз» в соседних кампаниях давали мусорный трафик. «Красную Поляну» не минусуем: туристы ищут «Сочи и Красная Поляна на новый год» вместе, это аудитория G1. </w:t>
       </w:r>
     </w:p>
     <w:p>
@@ -1581,7 +1639,7 @@
           <w:b w:val="0"/>
           <w:i w:val="0"/>
         </w:rPr>
-        <w:t>Вместо G1 — код группы (G1…G5). {source} покажет площадку РСЯ в Метрике — по ней чистим стоп-лист.</w:t>
+        <w:t>Вместо G1 — код группы (G1…G3). В лыжной ЕПК — свой utm_campaign, чтобы статистика не смешивалась. {source} покажет площадку РСЯ в Метрике — по ней чистим стоп-лист.</w:t>
       </w:r>
     </w:p>
     <w:p>
@@ -1777,7 +1835,7 @@
           </w:tcPr>
           <w:p>
             <w:r>
-              <w:t>НГ · Лыжники Красной Поляны</w:t>
+              <w:t>НГ · Гости Сириуса и Имеретинки</w:t>
             </w:r>
           </w:p>
         </w:tc>
@@ -1787,7 +1845,7 @@
           </w:tcPr>
           <w:p>
             <w:r>
-              <w:t>Едут/находятся на горнолыжных курортах</w:t>
+              <w:t>Уже живут в отелях у моря</w:t>
             </w:r>
           </w:p>
         </w:tc>
@@ -1797,7 +1855,7 @@
           </w:tcPr>
           <w:p>
             <w:r>
-              <w:t>Сочи + ФТ Сириус + геосегменты курортов</w:t>
+              <w:t>ФТ Сириус, Адлерский р-н</w:t>
             </w:r>
           </w:p>
         </w:tc>
@@ -1807,7 +1865,7 @@
           </w:tcPr>
           <w:p>
             <w:r>
-              <w:t>Ключи + геосегменты</w:t>
+              <w:t>Ключи + сегменты отелей</w:t>
             </w:r>
           </w:p>
         </w:tc>
@@ -1839,7 +1897,7 @@
           </w:tcPr>
           <w:p>
             <w:r>
-              <w:t>НГ · Гости Сириуса и Имеретинки</w:t>
+              <w:t>НГ · Под парусом 1 800 ₽</w:t>
             </w:r>
           </w:p>
         </w:tc>
@@ -1849,7 +1907,7 @@
           </w:tcPr>
           <w:p>
             <w:r>
-              <w:t>Уже живут в отелях у моря</w:t>
+              <w:t>Хотят недорогую прогулку</w:t>
             </w:r>
           </w:p>
         </w:tc>
@@ -1859,7 +1917,7 @@
           </w:tcPr>
           <w:p>
             <w:r>
-              <w:t>ФТ Сириус, Адлерский р-н</w:t>
+              <w:t>Сочи + ФТ Сириус + Россия</w:t>
             </w:r>
           </w:p>
         </w:tc>
@@ -1869,131 +1927,7 @@
           </w:tcPr>
           <w:p>
             <w:r>
-              <w:t>Ключи + сегменты отелей</w:t>
-            </w:r>
-          </w:p>
-        </w:tc>
-        <w:tc>
-          <w:tcPr>
-            <w:tcW w:type="dxa" w:w="1701"/>
-          </w:tcPr>
-          <w:p>
-            <w:r>
-              <w:t>https://boat-sochi.ru/yachts_ny</w:t>
-            </w:r>
-          </w:p>
-        </w:tc>
-      </w:tr>
-      <w:tr>
-        <w:tc>
-          <w:tcPr>
-            <w:tcW w:type="dxa" w:w="567"/>
-          </w:tcPr>
-          <w:p>
-            <w:r>
-              <w:t>G4</w:t>
-            </w:r>
-          </w:p>
-        </w:tc>
-        <w:tc>
-          <w:tcPr>
-            <w:tcW w:type="dxa" w:w="1984"/>
-          </w:tcPr>
-          <w:p>
-            <w:r>
-              <w:t>НГ · Под парусом 1 800 ₽ (опц.)</w:t>
-            </w:r>
-          </w:p>
-        </w:tc>
-        <w:tc>
-          <w:tcPr>
-            <w:tcW w:type="dxa" w:w="2268"/>
-          </w:tcPr>
-          <w:p>
-            <w:r>
-              <w:t>Хотят недорогую прогулку</w:t>
-            </w:r>
-          </w:p>
-        </w:tc>
-        <w:tc>
-          <w:tcPr>
-            <w:tcW w:type="dxa" w:w="1701"/>
-          </w:tcPr>
-          <w:p>
-            <w:r>
-              <w:t>Сочи + ФТ Сириус + Россия</w:t>
-            </w:r>
-          </w:p>
-        </w:tc>
-        <w:tc>
-          <w:tcPr>
-            <w:tcW w:type="dxa" w:w="1701"/>
-          </w:tcPr>
-          <w:p>
-            <w:r>
               <w:t>Ключи</w:t>
-            </w:r>
-          </w:p>
-        </w:tc>
-        <w:tc>
-          <w:tcPr>
-            <w:tcW w:type="dxa" w:w="1701"/>
-          </w:tcPr>
-          <w:p>
-            <w:r>
-              <w:t>https://boat-sochi.ru/yachts_ny</w:t>
-            </w:r>
-          </w:p>
-        </w:tc>
-      </w:tr>
-      <w:tr>
-        <w:tc>
-          <w:tcPr>
-            <w:tcW w:type="dxa" w:w="567"/>
-          </w:tcPr>
-          <w:p>
-            <w:r>
-              <w:t>G5</w:t>
-            </w:r>
-          </w:p>
-        </w:tc>
-        <w:tc>
-          <w:tcPr>
-            <w:tcW w:type="dxa" w:w="1984"/>
-          </w:tcPr>
-          <w:p>
-            <w:r>
-              <w:t>Ретаргетинг сайта</w:t>
-            </w:r>
-          </w:p>
-        </w:tc>
-        <w:tc>
-          <w:tcPr>
-            <w:tcW w:type="dxa" w:w="2268"/>
-          </w:tcPr>
-          <w:p>
-            <w:r>
-              <w:t>Были на boat-sochi.ru и не оставили контакт</w:t>
-            </w:r>
-          </w:p>
-        </w:tc>
-        <w:tc>
-          <w:tcPr>
-            <w:tcW w:type="dxa" w:w="1701"/>
-          </w:tcPr>
-          <w:p>
-            <w:r>
-              <w:t>Россия</w:t>
-            </w:r>
-          </w:p>
-        </w:tc>
-        <w:tc>
-          <w:tcPr>
-            <w:tcW w:type="dxa" w:w="1701"/>
-          </w:tcPr>
-          <w:p>
-            <w:r>
-              <w:t>Условие подбора аудитории</w:t>
             </w:r>
           </w:p>
         </w:tc>
@@ -2010,6 +1944,15 @@
       </w:tr>
     </w:tbl>
     <w:p/>
+    <w:p>
+      <w:r>
+        <w:rPr>
+          <w:b w:val="0"/>
+          <w:i/>
+        </w:rPr>
+        <w:t>Не входят в кампанию: лыжники/сноубордисты (отдельная ЕПК с отдельной посадочной) и ретаргетинг посетителей сайта.</w:t>
+      </w:r>
+    </w:p>
     <w:p>
       <w:r>
         <w:rPr>
@@ -2040,7 +1983,7 @@
         <w:pStyle w:val="ListBullet"/>
       </w:pPr>
       <w:r>
-        <w:t>Офферный ретаргетинг РСЯ — ВКЛ.</w:t>
+        <w:t>Офферный ретаргетинг РСЯ — ВЫКЛ. Условия подбора аудитории по посетителям сайта не добавлять.</w:t>
       </w:r>
     </w:p>
     <w:p>
@@ -2048,7 +1991,7 @@
         <w:pStyle w:val="ListBullet"/>
       </w:pPr>
       <w:r>
-        <w:t>Расширенный географический таргетинг — ВКЛ (кроме G3).</w:t>
+        <w:t>Расширенный географический таргетинг — ВКЛ (кроме G2).</w:t>
       </w:r>
     </w:p>
     <w:p>
@@ -2751,719 +2694,7 @@
         <w:pStyle w:val="Heading1"/>
       </w:pPr>
       <w:r>
-        <w:t>G2. НГ · Лыжники и сноубордисты Красной Поляны</w:t>
-      </w:r>
-    </w:p>
-    <w:p>
-      <w:r>
-        <w:rPr>
-          <w:b w:val="0"/>
-          <w:i w:val="0"/>
-        </w:rPr>
-        <w:t>Туристы на горнолыжных курортах (Роза Хутор, Газпром, Красная Поляна). Идея креатива — «С гор — на яхту»: свободный от трасс день провести в море. Сириус связан с Поляной «Ласточкой» и электричкой.</w:t>
-      </w:r>
-    </w:p>
-    <w:tbl>
-      <w:tblPr>
-        <w:tblStyle w:val="TableGrid"/>
-        <w:tblW w:type="auto" w:w="0"/>
-        <w:tblLook w:firstColumn="1" w:firstRow="1" w:lastColumn="0" w:lastRow="0" w:noHBand="0" w:noVBand="1" w:val="04A0"/>
-      </w:tblPr>
-      <w:tblGrid>
-        <w:gridCol w:w="5100"/>
-        <w:gridCol w:w="5100"/>
-      </w:tblGrid>
-      <w:tr>
-        <w:tc>
-          <w:tcPr>
-            <w:tcW w:type="dxa" w:w="2835"/>
-            <w:shd w:val="clear" w:color="auto" w:fill="DCE6F1"/>
-          </w:tcPr>
-          <w:p>
-            <w:r/>
-            <w:r>
-              <w:rPr>
-                <w:b/>
-              </w:rPr>
-              <w:t>Настройка</w:t>
-            </w:r>
-          </w:p>
-        </w:tc>
-        <w:tc>
-          <w:tcPr>
-            <w:tcW w:type="dxa" w:w="7087"/>
-            <w:shd w:val="clear" w:color="auto" w:fill="DCE6F1"/>
-          </w:tcPr>
-          <w:p>
-            <w:r/>
-            <w:r>
-              <w:rPr>
-                <w:b/>
-              </w:rPr>
-              <w:t>Значение</w:t>
-            </w:r>
-          </w:p>
-        </w:tc>
-      </w:tr>
-      <w:tr>
-        <w:tc>
-          <w:tcPr>
-            <w:tcW w:type="dxa" w:w="2835"/>
-          </w:tcPr>
-          <w:p>
-            <w:r>
-              <w:t>Гео</w:t>
-            </w:r>
-          </w:p>
-        </w:tc>
-        <w:tc>
-          <w:tcPr>
-            <w:tcW w:type="dxa" w:w="7087"/>
-          </w:tcPr>
-          <w:p>
-            <w:r>
-              <w:t>Сочи + Федеральная территория Сириус</w:t>
-            </w:r>
-          </w:p>
-        </w:tc>
-      </w:tr>
-      <w:tr>
-        <w:tc>
-          <w:tcPr>
-            <w:tcW w:type="dxa" w:w="2835"/>
-          </w:tcPr>
-          <w:p>
-            <w:r>
-              <w:t>Геосегменты (Яндекс Аудитории)</w:t>
-            </w:r>
-          </w:p>
-        </w:tc>
-        <w:tc>
-          <w:tcPr>
-            <w:tcW w:type="dxa" w:w="7087"/>
-          </w:tcPr>
-          <w:p>
-            <w:r>
-              <w:t>Полигоны: Роза Хутор (Роза Долина, Роза Плато, Горная олимпийская деревня); Газпром «Лаура» и «Альпика»; «Горки Город» (+540, +960); посёлок Красная Поляна. Тип «Регулярно посещают / недавно были», период 7–14 дней. Каждый сегмент — от 1 000 человек, иначе объединить</w:t>
-            </w:r>
-          </w:p>
-        </w:tc>
-      </w:tr>
-      <w:tr>
-        <w:tc>
-          <w:tcPr>
-            <w:tcW w:type="dxa" w:w="2835"/>
-          </w:tcPr>
-          <w:p>
-            <w:r>
-              <w:t>Look-alike</w:t>
-            </w:r>
-          </w:p>
-        </w:tc>
-        <w:tc>
-          <w:tcPr>
-            <w:tcW w:type="dxa" w:w="7087"/>
-          </w:tcPr>
-          <w:p>
-            <w:r>
-              <w:t>ВЫКЛ на старте (сегменты и так широкие в сезон)</w:t>
-            </w:r>
-          </w:p>
-        </w:tc>
-      </w:tr>
-      <w:tr>
-        <w:tc>
-          <w:tcPr>
-            <w:tcW w:type="dxa" w:w="2835"/>
-          </w:tcPr>
-          <w:p>
-            <w:r>
-              <w:t>Автотаргетинг</w:t>
-            </w:r>
-          </w:p>
-        </w:tc>
-        <w:tc>
-          <w:tcPr>
-            <w:tcW w:type="dxa" w:w="7087"/>
-          </w:tcPr>
-          <w:p>
-            <w:r>
-              <w:t>Целевые + узкие</w:t>
-            </w:r>
-          </w:p>
-        </w:tc>
-      </w:tr>
-      <w:tr>
-        <w:tc>
-          <w:tcPr>
-            <w:tcW w:type="dxa" w:w="2835"/>
-          </w:tcPr>
-          <w:p>
-            <w:r>
-              <w:t>Креативы</w:t>
-            </w:r>
-          </w:p>
-        </w:tc>
-        <w:tc>
-          <w:tcPr>
-            <w:tcW w:type="dxa" w:w="7087"/>
-          </w:tcPr>
-          <w:p>
-            <w:r>
-              <w:t>Гранж: сноубордист/лыжник над яхтой, «С ГОР — НА ЯХТУ»</w:t>
-            </w:r>
-          </w:p>
-        </w:tc>
-      </w:tr>
-    </w:tbl>
-    <w:p/>
-    <w:p>
-      <w:pPr>
-        <w:pStyle w:val="Heading2"/>
-      </w:pPr>
-      <w:r>
-        <w:t>Ключевые фразы (сигналы аудитории в РСЯ)</w:t>
-      </w:r>
-    </w:p>
-    <w:p>
-      <w:r>
-        <w:rPr>
-          <w:rFonts w:ascii="Consolas" w:hAnsi="Consolas"/>
-          <w:sz w:val="19"/>
-        </w:rPr>
-        <w:t>роза хутор</w:t>
-        <w:br/>
-        <w:t>красная поляна</w:t>
-        <w:br/>
-        <w:t>газпром лаура</w:t>
-        <w:br/>
-        <w:t>горки город</w:t>
-        <w:br/>
-        <w:t>ски пасс роза хутор</w:t>
-        <w:br/>
-        <w:t>горнолыжный курорт сочи</w:t>
-        <w:br/>
-        <w:t>трассы роза хутор</w:t>
-        <w:br/>
-        <w:t>катание на лыжах красная поляна</w:t>
-        <w:br/>
-        <w:t>сноуборд красная поляна</w:t>
-        <w:br/>
-        <w:t>прокат лыж роза хутор</w:t>
-        <w:br/>
-        <w:t>погода красная поляна</w:t>
-        <w:br/>
-        <w:t>что делать на красной поляне кроме лыж</w:t>
-      </w:r>
-    </w:p>
-    <w:p>
-      <w:pPr>
-        <w:pStyle w:val="Heading2"/>
-      </w:pPr>
-      <w:r>
-        <w:t>Объявление ЕПК</w:t>
-      </w:r>
-    </w:p>
-    <w:p>
-      <w:r>
-        <w:rPr>
-          <w:b/>
-          <w:i w:val="0"/>
-        </w:rPr>
-        <w:t>Заголовки (до 56 символов, можно до 7):</w:t>
-      </w:r>
-    </w:p>
-    <w:tbl>
-      <w:tblPr>
-        <w:tblStyle w:val="TableGrid"/>
-        <w:tblW w:type="auto" w:w="0"/>
-        <w:tblLook w:firstColumn="1" w:firstRow="1" w:lastColumn="0" w:lastRow="0" w:noHBand="0" w:noVBand="1" w:val="04A0"/>
-      </w:tblPr>
-      <w:tblGrid>
-        <w:gridCol w:w="3400"/>
-        <w:gridCol w:w="3400"/>
-        <w:gridCol w:w="3400"/>
-      </w:tblGrid>
-      <w:tr>
-        <w:tc>
-          <w:tcPr>
-            <w:tcW w:type="dxa" w:w="567"/>
-            <w:shd w:val="clear" w:color="auto" w:fill="DCE6F1"/>
-          </w:tcPr>
-          <w:p>
-            <w:r/>
-            <w:r>
-              <w:rPr>
-                <w:b/>
-              </w:rPr>
-              <w:t>№</w:t>
-            </w:r>
-          </w:p>
-        </w:tc>
-        <w:tc>
-          <w:tcPr>
-            <w:tcW w:type="dxa" w:w="7937"/>
-            <w:shd w:val="clear" w:color="auto" w:fill="DCE6F1"/>
-          </w:tcPr>
-          <w:p>
-            <w:r/>
-            <w:r>
-              <w:rPr>
-                <w:b/>
-              </w:rPr>
-              <w:t>Заголовок</w:t>
-            </w:r>
-          </w:p>
-        </w:tc>
-        <w:tc>
-          <w:tcPr>
-            <w:tcW w:type="dxa" w:w="1417"/>
-            <w:shd w:val="clear" w:color="auto" w:fill="DCE6F1"/>
-          </w:tcPr>
-          <w:p>
-            <w:r/>
-            <w:r>
-              <w:rPr>
-                <w:b/>
-              </w:rPr>
-              <w:t>Символов</w:t>
-            </w:r>
-          </w:p>
-        </w:tc>
-      </w:tr>
-      <w:tr>
-        <w:tc>
-          <w:tcPr>
-            <w:tcW w:type="dxa" w:w="567"/>
-          </w:tcPr>
-          <w:p>
-            <w:r>
-              <w:t>1</w:t>
-            </w:r>
-          </w:p>
-        </w:tc>
-        <w:tc>
-          <w:tcPr>
-            <w:tcW w:type="dxa" w:w="7937"/>
-          </w:tcPr>
-          <w:p>
-            <w:r>
-              <w:t>С гор — на яхту: морская прогулка в Сириусе</w:t>
-            </w:r>
-          </w:p>
-        </w:tc>
-        <w:tc>
-          <w:tcPr>
-            <w:tcW w:type="dxa" w:w="1417"/>
-          </w:tcPr>
-          <w:p>
-            <w:r>
-              <w:t>43</w:t>
-            </w:r>
-          </w:p>
-        </w:tc>
-      </w:tr>
-      <w:tr>
-        <w:tc>
-          <w:tcPr>
-            <w:tcW w:type="dxa" w:w="567"/>
-          </w:tcPr>
-          <w:p>
-            <w:r>
-              <w:t>2</w:t>
-            </w:r>
-          </w:p>
-        </w:tc>
-        <w:tc>
-          <w:tcPr>
-            <w:tcW w:type="dxa" w:w="7937"/>
-          </w:tcPr>
-          <w:p>
-            <w:r>
-              <w:t>Катались на Поляне? Выйдите в море в Сириусе</w:t>
-            </w:r>
-          </w:p>
-        </w:tc>
-        <w:tc>
-          <w:tcPr>
-            <w:tcW w:type="dxa" w:w="1417"/>
-          </w:tcPr>
-          <w:p>
-            <w:r>
-              <w:t>44</w:t>
-            </w:r>
-          </w:p>
-        </w:tc>
-      </w:tr>
-      <w:tr>
-        <w:tc>
-          <w:tcPr>
-            <w:tcW w:type="dxa" w:w="567"/>
-          </w:tcPr>
-          <w:p>
-            <w:r>
-              <w:t>3</w:t>
-            </w:r>
-          </w:p>
-        </w:tc>
-        <w:tc>
-          <w:tcPr>
-            <w:tcW w:type="dxa" w:w="7937"/>
-          </w:tcPr>
-          <w:p>
-            <w:r>
-              <w:t>Лыжи и море в одну поездку: яхта в Сириусе</w:t>
-            </w:r>
-          </w:p>
-        </w:tc>
-        <w:tc>
-          <w:tcPr>
-            <w:tcW w:type="dxa" w:w="1417"/>
-          </w:tcPr>
-          <w:p>
-            <w:r>
-              <w:t>42</w:t>
-            </w:r>
-          </w:p>
-        </w:tc>
-      </w:tr>
-      <w:tr>
-        <w:tc>
-          <w:tcPr>
-            <w:tcW w:type="dxa" w:w="567"/>
-          </w:tcPr>
-          <w:p>
-            <w:r>
-              <w:t>4</w:t>
-            </w:r>
-          </w:p>
-        </w:tc>
-        <w:tc>
-          <w:tcPr>
-            <w:tcW w:type="dxa" w:w="7937"/>
-          </w:tcPr>
-          <w:p>
-            <w:r>
-              <w:t>День без трасс — прогулка на яхте в Сириусе</w:t>
-            </w:r>
-          </w:p>
-        </w:tc>
-        <w:tc>
-          <w:tcPr>
-            <w:tcW w:type="dxa" w:w="1417"/>
-          </w:tcPr>
-          <w:p>
-            <w:r>
-              <w:t>43</w:t>
-            </w:r>
-          </w:p>
-        </w:tc>
-      </w:tr>
-      <w:tr>
-        <w:tc>
-          <w:tcPr>
-            <w:tcW w:type="dxa" w:w="567"/>
-          </w:tcPr>
-          <w:p>
-            <w:r>
-              <w:t>5</w:t>
-            </w:r>
-          </w:p>
-        </w:tc>
-        <w:tc>
-          <w:tcPr>
-            <w:tcW w:type="dxa" w:w="7937"/>
-          </w:tcPr>
-          <w:p>
-            <w:r>
-              <w:t>От Поляны до моря — на «Ласточке». Яхта ждёт</w:t>
-            </w:r>
-          </w:p>
-        </w:tc>
-        <w:tc>
-          <w:tcPr>
-            <w:tcW w:type="dxa" w:w="1417"/>
-          </w:tcPr>
-          <w:p>
-            <w:r>
-              <w:t>44</w:t>
-            </w:r>
-          </w:p>
-        </w:tc>
-      </w:tr>
-      <w:tr>
-        <w:tc>
-          <w:tcPr>
-            <w:tcW w:type="dxa" w:w="567"/>
-          </w:tcPr>
-          <w:p>
-            <w:r>
-              <w:t>6</w:t>
-            </w:r>
-          </w:p>
-        </w:tc>
-        <w:tc>
-          <w:tcPr>
-            <w:tcW w:type="dxa" w:w="7937"/>
-          </w:tcPr>
-          <w:p>
-            <w:r>
-              <w:t>Снежные вершины с палубы яхты. Сириус</w:t>
-            </w:r>
-          </w:p>
-        </w:tc>
-        <w:tc>
-          <w:tcPr>
-            <w:tcW w:type="dxa" w:w="1417"/>
-          </w:tcPr>
-          <w:p>
-            <w:r>
-              <w:t>37</w:t>
-            </w:r>
-          </w:p>
-        </w:tc>
-      </w:tr>
-      <w:tr>
-        <w:tc>
-          <w:tcPr>
-            <w:tcW w:type="dxa" w:w="567"/>
-          </w:tcPr>
-          <w:p>
-            <w:r>
-              <w:t>7</w:t>
-            </w:r>
-          </w:p>
-        </w:tc>
-        <w:tc>
-          <w:tcPr>
-            <w:tcW w:type="dxa" w:w="7937"/>
-          </w:tcPr>
-          <w:p>
-            <w:r>
-              <w:t>Новогодние каникулы: горы утром, море днём</w:t>
-            </w:r>
-          </w:p>
-        </w:tc>
-        <w:tc>
-          <w:tcPr>
-            <w:tcW w:type="dxa" w:w="1417"/>
-          </w:tcPr>
-          <w:p>
-            <w:r>
-              <w:t>42</w:t>
-            </w:r>
-          </w:p>
-        </w:tc>
-      </w:tr>
-    </w:tbl>
-    <w:p/>
-    <w:p>
-      <w:r>
-        <w:rPr>
-          <w:b/>
-          <w:i w:val="0"/>
-        </w:rPr>
-        <w:t>Тексты (до 81 символа, можно до 3):</w:t>
-      </w:r>
-    </w:p>
-    <w:tbl>
-      <w:tblPr>
-        <w:tblStyle w:val="TableGrid"/>
-        <w:tblW w:type="auto" w:w="0"/>
-        <w:tblLook w:firstColumn="1" w:firstRow="1" w:lastColumn="0" w:lastRow="0" w:noHBand="0" w:noVBand="1" w:val="04A0"/>
-      </w:tblPr>
-      <w:tblGrid>
-        <w:gridCol w:w="3400"/>
-        <w:gridCol w:w="3400"/>
-        <w:gridCol w:w="3400"/>
-      </w:tblGrid>
-      <w:tr>
-        <w:tc>
-          <w:tcPr>
-            <w:tcW w:type="dxa" w:w="567"/>
-            <w:shd w:val="clear" w:color="auto" w:fill="DCE6F1"/>
-          </w:tcPr>
-          <w:p>
-            <w:r/>
-            <w:r>
-              <w:rPr>
-                <w:b/>
-              </w:rPr>
-              <w:t>№</w:t>
-            </w:r>
-          </w:p>
-        </w:tc>
-        <w:tc>
-          <w:tcPr>
-            <w:tcW w:type="dxa" w:w="7937"/>
-            <w:shd w:val="clear" w:color="auto" w:fill="DCE6F1"/>
-          </w:tcPr>
-          <w:p>
-            <w:r/>
-            <w:r>
-              <w:rPr>
-                <w:b/>
-              </w:rPr>
-              <w:t>Текст</w:t>
-            </w:r>
-          </w:p>
-        </w:tc>
-        <w:tc>
-          <w:tcPr>
-            <w:tcW w:type="dxa" w:w="1417"/>
-            <w:shd w:val="clear" w:color="auto" w:fill="DCE6F1"/>
-          </w:tcPr>
-          <w:p>
-            <w:r/>
-            <w:r>
-              <w:rPr>
-                <w:b/>
-              </w:rPr>
-              <w:t>Символов</w:t>
-            </w:r>
-          </w:p>
-        </w:tc>
-      </w:tr>
-      <w:tr>
-        <w:tc>
-          <w:tcPr>
-            <w:tcW w:type="dxa" w:w="567"/>
-          </w:tcPr>
-          <w:p>
-            <w:r>
-              <w:t>1</w:t>
-            </w:r>
-          </w:p>
-        </w:tc>
-        <w:tc>
-          <w:tcPr>
-            <w:tcW w:type="dxa" w:w="7937"/>
-          </w:tcPr>
-          <w:p>
-            <w:r>
-              <w:t>Свободный от трасс день — в море. Катер, яхта или парусник, 1–10 января.</w:t>
-            </w:r>
-          </w:p>
-        </w:tc>
-        <w:tc>
-          <w:tcPr>
-            <w:tcW w:type="dxa" w:w="1417"/>
-          </w:tcPr>
-          <w:p>
-            <w:r>
-              <w:t>72</w:t>
-            </w:r>
-          </w:p>
-        </w:tc>
-      </w:tr>
-      <w:tr>
-        <w:tc>
-          <w:tcPr>
-            <w:tcW w:type="dxa" w:w="567"/>
-          </w:tcPr>
-          <w:p>
-            <w:r>
-              <w:t>2</w:t>
-            </w:r>
-          </w:p>
-        </w:tc>
-        <w:tc>
-          <w:tcPr>
-            <w:tcW w:type="dxa" w:w="7937"/>
-          </w:tcPr>
-          <w:p>
-            <w:r>
-              <w:t>Бронь без предоплаты. Выход подтверждаем по погоде. Имеретинский порт.</w:t>
-            </w:r>
-          </w:p>
-        </w:tc>
-        <w:tc>
-          <w:tcPr>
-            <w:tcW w:type="dxa" w:w="1417"/>
-          </w:tcPr>
-          <w:p>
-            <w:r>
-              <w:t>70</w:t>
-            </w:r>
-          </w:p>
-        </w:tc>
-      </w:tr>
-      <w:tr>
-        <w:tc>
-          <w:tcPr>
-            <w:tcW w:type="dxa" w:w="567"/>
-          </w:tcPr>
-          <w:p>
-            <w:r>
-              <w:t>3</w:t>
-            </w:r>
-          </w:p>
-        </w:tc>
-        <w:tc>
-          <w:tcPr>
-            <w:tcW w:type="dxa" w:w="7937"/>
-          </w:tcPr>
-          <w:p>
-            <w:r>
-              <w:t>Снежные вершины с палубы. Капитан на борту, маршрут обсудим с вами.</w:t>
-            </w:r>
-          </w:p>
-        </w:tc>
-        <w:tc>
-          <w:tcPr>
-            <w:tcW w:type="dxa" w:w="1417"/>
-          </w:tcPr>
-          <w:p>
-            <w:r>
-              <w:t>67</w:t>
-            </w:r>
-          </w:p>
-        </w:tc>
-      </w:tr>
-    </w:tbl>
-    <w:p/>
-    <w:p>
-      <w:r>
-        <w:rPr>
-          <w:b w:val="0"/>
-          <w:i w:val="0"/>
-        </w:rPr>
-        <w:t>Ссылка: https://boat-sochi.ru/yachts_ny?utm_source=yandex&amp;utm_medium=cpc&amp;utm_campaign=epk_yachts_ny&amp;utm_content=G2_{ad_id}&amp;utm_term={keyword}&amp;site={source}</w:t>
-      </w:r>
-    </w:p>
-    <w:p>
-      <w:r>
-        <w:rPr>
-          <w:b w:val="0"/>
-          <w:i w:val="0"/>
-        </w:rPr>
-        <w:t>Цена в объявлении: от 1 800 ₽. Кнопка: «Забронировать».</w:t>
-      </w:r>
-    </w:p>
-    <w:p>
-      <w:r>
-        <w:rPr>
-          <w:b w:val="0"/>
-          <w:i w:val="0"/>
-        </w:rPr>
-        <w:t>Изображения: гранж-серия: горизонт 2000×1125 (16:9) — парусная яхта и сноубордист, лыжник с моторной яхтой; вертикаль 1125×2000 переобрезать в 3:4 (1500×2000): формат 9:16 для картинок ЕПК не принимается; квадрат 1024×1024 со сноубордистом.</w:t>
-      </w:r>
-    </w:p>
-    <w:p>
-      <w:r>
-        <w:rPr>
-          <w:b w:val="0"/>
-          <w:i/>
-        </w:rPr>
-        <w:t>Цена «от 1 800 ₽» — минимальная (парусник). Если G4 не запускаете — поставить «от 8 000 ₽» и убрать «парусник» из первого текста.</w:t>
-      </w:r>
-    </w:p>
-    <w:p>
-      <w:pPr>
-        <w:pStyle w:val="Heading1"/>
-      </w:pPr>
-      <w:r>
-        <w:t>G3. НГ · Гости Сириуса и Имеретинки</w:t>
+        <w:t>G2. НГ · Гости Сириуса и Имеретинки</w:t>
       </w:r>
     </w:p>
     <w:p>
@@ -4114,7 +3345,7 @@
           <w:b w:val="0"/>
           <w:i w:val="0"/>
         </w:rPr>
-        <w:t>Ссылка: https://boat-sochi.ru/yachts_ny?utm_source=yandex&amp;utm_medium=cpc&amp;utm_campaign=epk_yachts_ny&amp;utm_content=G3_{ad_id}&amp;utm_term={keyword}&amp;site={source}</w:t>
+        <w:t>Ссылка: https://boat-sochi.ru/yachts_ny?utm_source=yandex&amp;utm_medium=cpc&amp;utm_campaign=epk_yachts_ny&amp;utm_content=G2_{ad_id}&amp;utm_term={keyword}&amp;site={source}</w:t>
       </w:r>
     </w:p>
     <w:p>
@@ -4140,7 +3371,7 @@
         <w:pStyle w:val="Heading1"/>
       </w:pPr>
       <w:r>
-        <w:t>G4. НГ · Прогулка под парусом 1 800 ₽ (опционально)</w:t>
+        <w:t>G3. НГ · Прогулка под парусом 1 800 ₽</w:t>
       </w:r>
     </w:p>
     <w:p>
@@ -4149,7 +3380,7 @@
           <w:b w:val="0"/>
           <w:i w:val="0"/>
         </w:rPr>
-        <w:t>Групповая прогулка за человека — массовый продукт. ВНИМАНИЕ: тот же продукт продаёт ЕПК «Групповые прогулки» 713449981 (бюджетный пакет с рыбалкой). Запускать G4 только если групповой парусник в 713449981 на 1–10 января не рекламируется, иначе кампании будут конкурировать за одних и тех же людей.</w:t>
+        <w:t>Групповая прогулка за человека — массовый продукт. ВНИМАНИЕ: тот же продукт продаёт ЕПК «Групповые прогулки» 713449981 (бюджетный пакет с рыбалкой). На 1–10 января парусник в 713449981 приостановить или убрать из неё новогодние тексты, иначе кампании будут конкурировать за одних и тех же людей.</w:t>
       </w:r>
     </w:p>
     <w:tbl>
@@ -4699,7 +3930,7 @@
           <w:b w:val="0"/>
           <w:i w:val="0"/>
         </w:rPr>
-        <w:t>Ссылка: https://boat-sochi.ru/yachts_ny?utm_source=yandex&amp;utm_medium=cpc&amp;utm_campaign=epk_yachts_ny&amp;utm_content=G4_{ad_id}&amp;utm_term={keyword}&amp;site={source}</w:t>
+        <w:t>Ссылка: https://boat-sochi.ru/yachts_ny?utm_source=yandex&amp;utm_medium=cpc&amp;utm_campaign=epk_yachts_ny&amp;utm_content=G3_{ad_id}&amp;utm_term={keyword}&amp;site={source}</w:t>
       </w:r>
     </w:p>
     <w:p>
@@ -4725,607 +3956,7 @@
         <w:pStyle w:val="Heading1"/>
       </w:pPr>
       <w:r>
-        <w:t>G5. Ретаргетинг посетителей сайта</w:t>
-      </w:r>
-    </w:p>
-    <w:p>
-      <w:r>
-        <w:rPr>
-          <w:b w:val="0"/>
-          <w:i w:val="0"/>
-        </w:rPr>
-        <w:t>Были на boat-sochi.ru за 90 дней (любые страницы) и не достигли целей. Летние клиенты, которые снова едут в Сочи зимой, — самая тёплая аудитория.</w:t>
-      </w:r>
-    </w:p>
-    <w:tbl>
-      <w:tblPr>
-        <w:tblStyle w:val="TableGrid"/>
-        <w:tblW w:type="auto" w:w="0"/>
-        <w:tblLook w:firstColumn="1" w:firstRow="1" w:lastColumn="0" w:lastRow="0" w:noHBand="0" w:noVBand="1" w:val="04A0"/>
-      </w:tblPr>
-      <w:tblGrid>
-        <w:gridCol w:w="5100"/>
-        <w:gridCol w:w="5100"/>
-      </w:tblGrid>
-      <w:tr>
-        <w:tc>
-          <w:tcPr>
-            <w:tcW w:type="dxa" w:w="2835"/>
-            <w:shd w:val="clear" w:color="auto" w:fill="DCE6F1"/>
-          </w:tcPr>
-          <w:p>
-            <w:r/>
-            <w:r>
-              <w:rPr>
-                <w:b/>
-              </w:rPr>
-              <w:t>Настройка</w:t>
-            </w:r>
-          </w:p>
-        </w:tc>
-        <w:tc>
-          <w:tcPr>
-            <w:tcW w:type="dxa" w:w="7087"/>
-            <w:shd w:val="clear" w:color="auto" w:fill="DCE6F1"/>
-          </w:tcPr>
-          <w:p>
-            <w:r/>
-            <w:r>
-              <w:rPr>
-                <w:b/>
-              </w:rPr>
-              <w:t>Значение</w:t>
-            </w:r>
-          </w:p>
-        </w:tc>
-      </w:tr>
-      <w:tr>
-        <w:tc>
-          <w:tcPr>
-            <w:tcW w:type="dxa" w:w="2835"/>
-          </w:tcPr>
-          <w:p>
-            <w:r>
-              <w:t>Гео</w:t>
-            </w:r>
-          </w:p>
-        </w:tc>
-        <w:tc>
-          <w:tcPr>
-            <w:tcW w:type="dxa" w:w="7087"/>
-          </w:tcPr>
-          <w:p>
-            <w:r>
-              <w:t>Россия</w:t>
-            </w:r>
-          </w:p>
-        </w:tc>
-      </w:tr>
-      <w:tr>
-        <w:tc>
-          <w:tcPr>
-            <w:tcW w:type="dxa" w:w="2835"/>
-          </w:tcPr>
-          <w:p>
-            <w:r>
-              <w:t>Условие подбора аудитории</w:t>
-            </w:r>
-          </w:p>
-        </w:tc>
-        <w:tc>
-          <w:tcPr>
-            <w:tcW w:type="dxa" w:w="7087"/>
-          </w:tcPr>
-          <w:p>
-            <w:r>
-              <w:t>Посетили сайт (счётчик 94713538) за 90 дней И НЕ достигли целей 565362888, 306850396, 543735704, 458219702 за 30 дней</w:t>
-            </w:r>
-          </w:p>
-        </w:tc>
-      </w:tr>
-      <w:tr>
-        <w:tc>
-          <w:tcPr>
-            <w:tcW w:type="dxa" w:w="2835"/>
-          </w:tcPr>
-          <w:p>
-            <w:r>
-              <w:t>Look-alike</w:t>
-            </w:r>
-          </w:p>
-        </w:tc>
-        <w:tc>
-          <w:tcPr>
-            <w:tcW w:type="dxa" w:w="7087"/>
-          </w:tcPr>
-          <w:p>
-            <w:r>
-              <w:t>Отдельным условием, точность «средняя» — через 2 недели, если объём мал</w:t>
-            </w:r>
-          </w:p>
-        </w:tc>
-      </w:tr>
-      <w:tr>
-        <w:tc>
-          <w:tcPr>
-            <w:tcW w:type="dxa" w:w="2835"/>
-          </w:tcPr>
-          <w:p>
-            <w:r>
-              <w:t>Корректировка группы</w:t>
-            </w:r>
-          </w:p>
-        </w:tc>
-        <w:tc>
-          <w:tcPr>
-            <w:tcW w:type="dxa" w:w="7087"/>
-          </w:tcPr>
-          <w:p>
-            <w:r>
-              <w:t>Аудитория «Просмотр /yachts_ny» +20%</w:t>
-            </w:r>
-          </w:p>
-        </w:tc>
-      </w:tr>
-      <w:tr>
-        <w:tc>
-          <w:tcPr>
-            <w:tcW w:type="dxa" w:w="2835"/>
-          </w:tcPr>
-          <w:p>
-            <w:r>
-              <w:t>Ключевые фразы</w:t>
-            </w:r>
-          </w:p>
-        </w:tc>
-        <w:tc>
-          <w:tcPr>
-            <w:tcW w:type="dxa" w:w="7087"/>
-          </w:tcPr>
-          <w:p>
-            <w:r>
-              <w:t>Нет — только условие подбора аудитории</w:t>
-            </w:r>
-          </w:p>
-        </w:tc>
-      </w:tr>
-    </w:tbl>
-    <w:p/>
-    <w:p>
-      <w:pPr>
-        <w:pStyle w:val="Heading2"/>
-      </w:pPr>
-      <w:r>
-        <w:t>Объявление ЕПК</w:t>
-      </w:r>
-    </w:p>
-    <w:p>
-      <w:r>
-        <w:rPr>
-          <w:b/>
-          <w:i w:val="0"/>
-        </w:rPr>
-        <w:t>Заголовки (до 56 символов, можно до 7):</w:t>
-      </w:r>
-    </w:p>
-    <w:tbl>
-      <w:tblPr>
-        <w:tblStyle w:val="TableGrid"/>
-        <w:tblW w:type="auto" w:w="0"/>
-        <w:tblLook w:firstColumn="1" w:firstRow="1" w:lastColumn="0" w:lastRow="0" w:noHBand="0" w:noVBand="1" w:val="04A0"/>
-      </w:tblPr>
-      <w:tblGrid>
-        <w:gridCol w:w="3400"/>
-        <w:gridCol w:w="3400"/>
-        <w:gridCol w:w="3400"/>
-      </w:tblGrid>
-      <w:tr>
-        <w:tc>
-          <w:tcPr>
-            <w:tcW w:type="dxa" w:w="567"/>
-            <w:shd w:val="clear" w:color="auto" w:fill="DCE6F1"/>
-          </w:tcPr>
-          <w:p>
-            <w:r/>
-            <w:r>
-              <w:rPr>
-                <w:b/>
-              </w:rPr>
-              <w:t>№</w:t>
-            </w:r>
-          </w:p>
-        </w:tc>
-        <w:tc>
-          <w:tcPr>
-            <w:tcW w:type="dxa" w:w="7937"/>
-            <w:shd w:val="clear" w:color="auto" w:fill="DCE6F1"/>
-          </w:tcPr>
-          <w:p>
-            <w:r/>
-            <w:r>
-              <w:rPr>
-                <w:b/>
-              </w:rPr>
-              <w:t>Заголовок</w:t>
-            </w:r>
-          </w:p>
-        </w:tc>
-        <w:tc>
-          <w:tcPr>
-            <w:tcW w:type="dxa" w:w="1417"/>
-            <w:shd w:val="clear" w:color="auto" w:fill="DCE6F1"/>
-          </w:tcPr>
-          <w:p>
-            <w:r/>
-            <w:r>
-              <w:rPr>
-                <w:b/>
-              </w:rPr>
-              <w:t>Символов</w:t>
-            </w:r>
-          </w:p>
-        </w:tc>
-      </w:tr>
-      <w:tr>
-        <w:tc>
-          <w:tcPr>
-            <w:tcW w:type="dxa" w:w="567"/>
-          </w:tcPr>
-          <w:p>
-            <w:r>
-              <w:t>1</w:t>
-            </w:r>
-          </w:p>
-        </w:tc>
-        <w:tc>
-          <w:tcPr>
-            <w:tcW w:type="dxa" w:w="7937"/>
-          </w:tcPr>
-          <w:p>
-            <w:r>
-              <w:t>Вернуться к морю: яхта на новогодние каникулы</w:t>
-            </w:r>
-          </w:p>
-        </w:tc>
-        <w:tc>
-          <w:tcPr>
-            <w:tcW w:type="dxa" w:w="1417"/>
-          </w:tcPr>
-          <w:p>
-            <w:r>
-              <w:t>45</w:t>
-            </w:r>
-          </w:p>
-        </w:tc>
-      </w:tr>
-      <w:tr>
-        <w:tc>
-          <w:tcPr>
-            <w:tcW w:type="dxa" w:w="567"/>
-          </w:tcPr>
-          <w:p>
-            <w:r>
-              <w:t>2</w:t>
-            </w:r>
-          </w:p>
-        </w:tc>
-        <w:tc>
-          <w:tcPr>
-            <w:tcW w:type="dxa" w:w="7937"/>
-          </w:tcPr>
-          <w:p>
-            <w:r>
-              <w:t>Новогодние каникулы в Сириусе — яхта на ваши даты</w:t>
-            </w:r>
-          </w:p>
-        </w:tc>
-        <w:tc>
-          <w:tcPr>
-            <w:tcW w:type="dxa" w:w="1417"/>
-          </w:tcPr>
-          <w:p>
-            <w:r>
-              <w:t>49</w:t>
-            </w:r>
-          </w:p>
-        </w:tc>
-      </w:tr>
-      <w:tr>
-        <w:tc>
-          <w:tcPr>
-            <w:tcW w:type="dxa" w:w="567"/>
-          </w:tcPr>
-          <w:p>
-            <w:r>
-              <w:t>3</w:t>
-            </w:r>
-          </w:p>
-        </w:tc>
-        <w:tc>
-          <w:tcPr>
-            <w:tcW w:type="dxa" w:w="7937"/>
-          </w:tcPr>
-          <w:p>
-            <w:r>
-              <w:t>Выбрали яхту? Бронь на 1–10 января без предоплаты</w:t>
-            </w:r>
-          </w:p>
-        </w:tc>
-        <w:tc>
-          <w:tcPr>
-            <w:tcW w:type="dxa" w:w="1417"/>
-          </w:tcPr>
-          <w:p>
-            <w:r>
-              <w:t>49</w:t>
-            </w:r>
-          </w:p>
-        </w:tc>
-      </w:tr>
-      <w:tr>
-        <w:tc>
-          <w:tcPr>
-            <w:tcW w:type="dxa" w:w="567"/>
-          </w:tcPr>
-          <w:p>
-            <w:r>
-              <w:t>4</w:t>
-            </w:r>
-          </w:p>
-        </w:tc>
-        <w:tc>
-          <w:tcPr>
-            <w:tcW w:type="dxa" w:w="7937"/>
-          </w:tcPr>
-          <w:p>
-            <w:r>
-              <w:t>Летом с нами в море — теперь зимой с видом на горы</w:t>
-            </w:r>
-          </w:p>
-        </w:tc>
-        <w:tc>
-          <w:tcPr>
-            <w:tcW w:type="dxa" w:w="1417"/>
-          </w:tcPr>
-          <w:p>
-            <w:r>
-              <w:t>50</w:t>
-            </w:r>
-          </w:p>
-        </w:tc>
-      </w:tr>
-      <w:tr>
-        <w:tc>
-          <w:tcPr>
-            <w:tcW w:type="dxa" w:w="567"/>
-          </w:tcPr>
-          <w:p>
-            <w:r>
-              <w:t>5</w:t>
-            </w:r>
-          </w:p>
-        </w:tc>
-        <w:tc>
-          <w:tcPr>
-            <w:tcW w:type="dxa" w:w="7937"/>
-          </w:tcPr>
-          <w:p>
-            <w:r>
-              <w:t>Катер, яхта или парусник в Сириусе на каникулах</w:t>
-            </w:r>
-          </w:p>
-        </w:tc>
-        <w:tc>
-          <w:tcPr>
-            <w:tcW w:type="dxa" w:w="1417"/>
-          </w:tcPr>
-          <w:p>
-            <w:r>
-              <w:t>47</w:t>
-            </w:r>
-          </w:p>
-        </w:tc>
-      </w:tr>
-    </w:tbl>
-    <w:p/>
-    <w:p>
-      <w:r>
-        <w:rPr>
-          <w:b/>
-          <w:i w:val="0"/>
-        </w:rPr>
-        <w:t>Тексты (до 81 символа, можно до 3):</w:t>
-      </w:r>
-    </w:p>
-    <w:tbl>
-      <w:tblPr>
-        <w:tblStyle w:val="TableGrid"/>
-        <w:tblW w:type="auto" w:w="0"/>
-        <w:tblLook w:firstColumn="1" w:firstRow="1" w:lastColumn="0" w:lastRow="0" w:noHBand="0" w:noVBand="1" w:val="04A0"/>
-      </w:tblPr>
-      <w:tblGrid>
-        <w:gridCol w:w="3400"/>
-        <w:gridCol w:w="3400"/>
-        <w:gridCol w:w="3400"/>
-      </w:tblGrid>
-      <w:tr>
-        <w:tc>
-          <w:tcPr>
-            <w:tcW w:type="dxa" w:w="567"/>
-            <w:shd w:val="clear" w:color="auto" w:fill="DCE6F1"/>
-          </w:tcPr>
-          <w:p>
-            <w:r/>
-            <w:r>
-              <w:rPr>
-                <w:b/>
-              </w:rPr>
-              <w:t>№</w:t>
-            </w:r>
-          </w:p>
-        </w:tc>
-        <w:tc>
-          <w:tcPr>
-            <w:tcW w:type="dxa" w:w="7937"/>
-            <w:shd w:val="clear" w:color="auto" w:fill="DCE6F1"/>
-          </w:tcPr>
-          <w:p>
-            <w:r/>
-            <w:r>
-              <w:rPr>
-                <w:b/>
-              </w:rPr>
-              <w:t>Текст</w:t>
-            </w:r>
-          </w:p>
-        </w:tc>
-        <w:tc>
-          <w:tcPr>
-            <w:tcW w:type="dxa" w:w="1417"/>
-            <w:shd w:val="clear" w:color="auto" w:fill="DCE6F1"/>
-          </w:tcPr>
-          <w:p>
-            <w:r/>
-            <w:r>
-              <w:rPr>
-                <w:b/>
-              </w:rPr>
-              <w:t>Символов</w:t>
-            </w:r>
-          </w:p>
-        </w:tc>
-      </w:tr>
-      <w:tr>
-        <w:tc>
-          <w:tcPr>
-            <w:tcW w:type="dxa" w:w="567"/>
-          </w:tcPr>
-          <w:p>
-            <w:r>
-              <w:t>1</w:t>
-            </w:r>
-          </w:p>
-        </w:tc>
-        <w:tc>
-          <w:tcPr>
-            <w:tcW w:type="dxa" w:w="7937"/>
-          </w:tcPr>
-          <w:p>
-            <w:r>
-              <w:t>Оставьте дату 1–10 января — без предоплаты. Выход подтверждаем по погоде.</w:t>
-            </w:r>
-          </w:p>
-        </w:tc>
-        <w:tc>
-          <w:tcPr>
-            <w:tcW w:type="dxa" w:w="1417"/>
-          </w:tcPr>
-          <w:p>
-            <w:r>
-              <w:t>73</w:t>
-            </w:r>
-          </w:p>
-        </w:tc>
-      </w:tr>
-      <w:tr>
-        <w:tc>
-          <w:tcPr>
-            <w:tcW w:type="dxa" w:w="567"/>
-          </w:tcPr>
-          <w:p>
-            <w:r>
-              <w:t>2</w:t>
-            </w:r>
-          </w:p>
-        </w:tc>
-        <w:tc>
-          <w:tcPr>
-            <w:tcW w:type="dxa" w:w="7937"/>
-          </w:tcPr>
-          <w:p>
-            <w:r>
-              <w:t>Катер «Сириус», яхта «Бруно», парусник. Цена за всё судно без наценки.</w:t>
-            </w:r>
-          </w:p>
-        </w:tc>
-        <w:tc>
-          <w:tcPr>
-            <w:tcW w:type="dxa" w:w="1417"/>
-          </w:tcPr>
-          <w:p>
-            <w:r>
-              <w:t>70</w:t>
-            </w:r>
-          </w:p>
-        </w:tc>
-      </w:tr>
-      <w:tr>
-        <w:tc>
-          <w:tcPr>
-            <w:tcW w:type="dxa" w:w="567"/>
-          </w:tcPr>
-          <w:p>
-            <w:r>
-              <w:t>3</w:t>
-            </w:r>
-          </w:p>
-        </w:tc>
-        <w:tc>
-          <w:tcPr>
-            <w:tcW w:type="dxa" w:w="7937"/>
-          </w:tcPr>
-          <w:p>
-            <w:r>
-              <w:t>Имеретинский порт, линия 1. Звоните: +7 917 675-05-55.</w:t>
-            </w:r>
-          </w:p>
-        </w:tc>
-        <w:tc>
-          <w:tcPr>
-            <w:tcW w:type="dxa" w:w="1417"/>
-          </w:tcPr>
-          <w:p>
-            <w:r>
-              <w:t>54</w:t>
-            </w:r>
-          </w:p>
-        </w:tc>
-      </w:tr>
-    </w:tbl>
-    <w:p/>
-    <w:p>
-      <w:r>
-        <w:rPr>
-          <w:b w:val="0"/>
-          <w:i w:val="0"/>
-        </w:rPr>
-        <w:t>Ссылка: https://boat-sochi.ru/yachts_ny?utm_source=yandex&amp;utm_medium=cpc&amp;utm_campaign=epk_yachts_ny&amp;utm_content=G5_{ad_id}&amp;utm_term={keyword}&amp;site={source}</w:t>
-      </w:r>
-    </w:p>
-    <w:p>
-      <w:r>
-        <w:rPr>
-          <w:b w:val="0"/>
-          <w:i w:val="0"/>
-        </w:rPr>
-        <w:t>Цена в объявлении: от 1 800 ₽. Кнопка: «Забронировать».</w:t>
-      </w:r>
-    </w:p>
-    <w:p>
-      <w:r>
-        <w:rPr>
-          <w:b w:val="0"/>
-          <w:i w:val="0"/>
-        </w:rPr>
-        <w:t>Изображения: все креативы серии (смешать «чистые» синие и гранж), до 5 изображений.</w:t>
-      </w:r>
-    </w:p>
-    <w:p>
-      <w:pPr>
-        <w:pStyle w:val="Heading1"/>
-      </w:pPr>
-      <w:r>
-        <w:t>8. Расширения (одинаковые для всех групп)</w:t>
+        <w:t>6. Расширения (одинаковые для всех групп)</w:t>
       </w:r>
     </w:p>
     <w:p>
@@ -5333,7 +3964,7 @@
         <w:pStyle w:val="Heading2"/>
       </w:pPr>
       <w:r>
-        <w:t>8.1. Быстрые ссылки — 8 штук (заголовок до 30, описание до 60)</w:t>
+        <w:t>6.1. Быстрые ссылки — 8 штук (заголовок до 30, описание до 60)</w:t>
       </w:r>
     </w:p>
     <w:tbl>
@@ -5946,7 +4577,7 @@
           <w:b w:val="0"/>
           <w:i/>
         </w:rPr>
-        <w:t>Параметр ?sl=N делает адреса быстрых ссылок разными. В G4 первыми поставить «Под парусом — 1 800 ₽» и «Бронь без предоплаты».</w:t>
+        <w:t>Параметр ?sl=N делает адреса быстрых ссылок разными. В G3 первыми поставить «Под парусом — 1 800 ₽» и «Бронь без предоплаты».</w:t>
       </w:r>
     </w:p>
     <w:p>
@@ -5954,7 +4585,7 @@
         <w:pStyle w:val="Heading2"/>
       </w:pPr>
       <w:r>
-        <w:t>8.2. Уточнения (до 25 символов каждое, всего до 132)</w:t>
+        <w:t>6.2. Уточнения (до 25 символов каждое, всего до 132)</w:t>
       </w:r>
     </w:p>
     <w:tbl>
@@ -6276,7 +4907,7 @@
         <w:pStyle w:val="Heading2"/>
       </w:pPr>
       <w:r>
-        <w:t>8.3. Изображения и видео</w:t>
+        <w:t>6.3. Изображения и видео</w:t>
       </w:r>
     </w:p>
     <w:p>
@@ -6324,7 +4955,7 @@
         <w:pStyle w:val="Heading2"/>
       </w:pPr>
       <w:r>
-        <w:t>8.4. Оценка присланных креативов</w:t>
+        <w:t>6.4. Оценка присланных креативов</w:t>
       </w:r>
     </w:p>
     <w:tbl>
@@ -6418,7 +5049,7 @@
           </w:tcPr>
           <w:p>
             <w:r>
-              <w:t>G1, G3, G5</w:t>
+              <w:t>G1, G2</w:t>
             </w:r>
           </w:p>
         </w:tc>
@@ -6460,7 +5091,7 @@
           </w:tcPr>
           <w:p>
             <w:r>
-              <w:t>G1, G3</w:t>
+              <w:t>G1, G2</w:t>
             </w:r>
           </w:p>
         </w:tc>
@@ -6544,7 +5175,7 @@
           </w:tcPr>
           <w:p>
             <w:r>
-              <w:t>G4, G3</w:t>
+              <w:t>G3, G2</w:t>
             </w:r>
           </w:p>
         </w:tc>
@@ -6586,7 +5217,7 @@
           </w:tcPr>
           <w:p>
             <w:r>
-              <w:t>G4, G5</w:t>
+              <w:t>G3</w:t>
             </w:r>
           </w:p>
         </w:tc>
@@ -6628,7 +5259,7 @@
           </w:tcPr>
           <w:p>
             <w:r>
-              <w:t>G2</w:t>
+              <w:t>— (лыжная ЕПК)</w:t>
             </w:r>
           </w:p>
         </w:tc>
@@ -6648,7 +5279,7 @@
           </w:tcPr>
           <w:p>
             <w:r>
-              <w:t>Без кнопок на картинке (модерация)</w:t>
+              <w:t>В эту кампанию не ставить: ведёт на лыжную посадочную</w:t>
             </w:r>
           </w:p>
         </w:tc>
@@ -6660,7 +5291,7 @@
         <w:pStyle w:val="Heading1"/>
       </w:pPr>
       <w:r>
-        <w:t>9. План по датам</w:t>
+        <w:t>7. План по датам</w:t>
       </w:r>
     </w:p>
     <w:tbl>
@@ -6722,7 +5353,7 @@
           </w:tcPr>
           <w:p>
             <w:r>
-              <w:t>Запуск G1, G3, G5 (+G2 с 15.11, когда соберутся геосегменты). Бюджет 7 000 ₽/нед. Не трогать 7 дней.</w:t>
+              <w:t>Запуск G1, G2, G3. Бюджет 7 000 ₽/нед. Не трогать 7 дней.</w:t>
             </w:r>
           </w:p>
         </w:tc>
@@ -6788,7 +5419,7 @@
           </w:tcPr>
           <w:p>
             <w:r>
-              <w:t>Зимняя фаза. На посадочной сейчас «1–10 января» — нужно: либо обновить /yachts_ny на «зимние прогулки, январь–февраль», либо сделать страницу /yachts_winter. В объявлениях убрать «1–10 января», «новогодние каникулы» → «зимой». Бюджет 7 000 ₽/нед. G2 оставить до конца горнолыжного сезона.</w:t>
+              <w:t>Зимняя фаза. На посадочной сейчас «1–10 января» — нужно: либо обновить /yachts_ny на «зимние прогулки, январь–февраль», либо сделать страницу /yachts_winter. В объявлениях убрать «1–10 января», «новогодние каникулы» → «зимой». Бюджет 7 000 ₽/нед.</w:t>
             </w:r>
           </w:p>
         </w:tc>
@@ -6800,7 +5431,7 @@
         <w:pStyle w:val="Heading1"/>
       </w:pPr>
       <w:r>
-        <w:t>10. Перед запуском — чек-лист</w:t>
+        <w:t>8. Перед запуском — чек-лист</w:t>
       </w:r>
     </w:p>
     <w:p>
@@ -6824,7 +5455,7 @@
         <w:pStyle w:val="ListBullet"/>
       </w:pPr>
       <w:r>
-        <w:t>Обновить микроразметку /yachts_ny: на странице всё ещё «Лилу» 16 000 ₽/час, а в продаже прогулка под парусом 1 800 ₽/чел.</w:t>
+        <w:t>Вставить новую микроразметку /yachts_ny (парусник 1 800 ₽/чел. вместо «Лилу») и проверить в валидаторе Яндекса.</w:t>
       </w:r>
     </w:p>
     <w:p>
@@ -6832,7 +5463,15 @@
         <w:pStyle w:val="ListBullet"/>
       </w:pPr>
       <w:r>
-        <w:t>Решить по G4 и ЕПК «Групповые прогулки» 713449981 — кто продаёт парусник на 1–10 января.</w:t>
+        <w:t>Приостановить парусник на 1–10 января в ЕПК «Групповые прогулки» 713449981 (или убрать оттуда новогодние тексты) — его продаёт G3.</w:t>
+      </w:r>
+    </w:p>
+    <w:p>
+      <w:pPr>
+        <w:pStyle w:val="ListBullet"/>
+      </w:pPr>
+      <w:r>
+        <w:t>Согласовать с лыжной ЕПК: разные utm_campaign, в ней — своя посадочная; лыжные сигналы здесь уже заминусованы.</w:t>
       </w:r>
     </w:p>
     <w:p>
@@ -6856,7 +5495,7 @@
         <w:pStyle w:val="Heading1"/>
       </w:pPr>
       <w:r>
-        <w:t>11. Что не писать в объявлениях</w:t>
+        <w:t>9. Что не писать в объявлениях</w:t>
       </w:r>
     </w:p>
     <w:p>

</xml_diff>

<commit_message>
EPK /yachts_ny: single landing page for all phases, ski EPK budget separate
Co-authored-by: Igor-Lark <Igor-Lark@users.noreply.github.com>
</commit_message>
<xml_diff>
--- a/reklama/EPK_yachts_ny_NG2027_zima.docx
+++ b/reklama/EPK_yachts_ny_NG2027_zima.docx
@@ -81,7 +81,7 @@
         <w:pStyle w:val="ListBullet"/>
       </w:pPr>
       <w:r>
-        <w:t>Период: запуск 01.11.2026 → активная фаза до 10.01.2027 → зима 11.01–28.02.2027 (нужна правка посадочной, см. раздел 7).</w:t>
+        <w:t>Период: запуск 01.11.2026 → активная фаза до 10.01.2027 → зима 11.01–28.02.2027 (посадочная всё время /yachts_ny, с 11.01 обновить на ней тексты, см. раздел 7).</w:t>
       </w:r>
     </w:p>
     <w:p>
@@ -277,7 +277,7 @@
           </w:tcPr>
           <w:p>
             <w:r>
-              <w:t>С 11.01 — смена текстов и ссылки (раздел 7)</w:t>
+              <w:t>С 11.01 — смена текстов, посадочная та же (раздел 7)</w:t>
             </w:r>
           </w:p>
         </w:tc>
@@ -403,7 +403,7 @@
           </w:tcPr>
           <w:p>
             <w:r>
-              <w:t>Не пакетная: отдельный бюджет, чтобы НГ не съедал «Сириус» и рыбалку</w:t>
+              <w:t>Не пакетная: отдельный бюджет, чтобы НГ не съедал «Сириус» и рыбалку. У лыжной ЕПК — свой бюджет, из этого не делится</w:t>
             </w:r>
           </w:p>
         </w:tc>
@@ -5419,7 +5419,7 @@
           </w:tcPr>
           <w:p>
             <w:r>
-              <w:t>Зимняя фаза. На посадочной сейчас «1–10 января» — нужно: либо обновить /yachts_ny на «зимние прогулки, январь–февраль», либо сделать страницу /yachts_winter. В объявлениях убрать «1–10 января», «новогодние каникулы» → «зимой». Бюджет 7 000 ₽/нед.</w:t>
+              <w:t>Зимняя фаза. На посадочной сейчас «1–10 января» — нужно: обновить /yachts_ny на «зимние прогулки, январь–февраль» (посадочная остаётся та же, ссылки в объявлениях не меняются). В объявлениях убрать «1–10 января», «новогодние каникулы» → «зимой». Бюджет 7 000 ₽/нед.</w:t>
             </w:r>
           </w:p>
         </w:tc>

</xml_diff>

<commit_message>
EPK /yachts_ny: add two reserve sitelinks
Co-authored-by: Igor-Lark <Igor-Lark@users.noreply.github.com>
</commit_message>
<xml_diff>
--- a/reklama/EPK_yachts_ny_NG2027_zima.docx
+++ b/reklama/EPK_yachts_ny_NG2027_zima.docx
@@ -4565,6 +4565,283 @@
           <w:p>
             <w:r>
               <w:t>https://boat-sochi.ru/yachts_ny?sl=8#book</w:t>
+            </w:r>
+          </w:p>
+        </w:tc>
+      </w:tr>
+    </w:tbl>
+    <w:p/>
+    <w:p>
+      <w:r>
+        <w:rPr>
+          <w:b/>
+          <w:i w:val="0"/>
+        </w:rPr>
+        <w:t>Запасные быстрые ссылки (в ЕПК максимум 8 — ставить вместо слабых):</w:t>
+      </w:r>
+    </w:p>
+    <w:tbl>
+      <w:tblPr>
+        <w:tblStyle w:val="TableGrid"/>
+        <w:tblW w:type="auto" w:w="0"/>
+        <w:tblLook w:firstColumn="1" w:firstRow="1" w:lastColumn="0" w:lastRow="0" w:noHBand="0" w:noVBand="1" w:val="04A0"/>
+      </w:tblPr>
+      <w:tblGrid>
+        <w:gridCol w:w="1457"/>
+        <w:gridCol w:w="1457"/>
+        <w:gridCol w:w="1457"/>
+        <w:gridCol w:w="1457"/>
+        <w:gridCol w:w="1457"/>
+        <w:gridCol w:w="1457"/>
+        <w:gridCol w:w="1457"/>
+      </w:tblGrid>
+      <w:tr>
+        <w:tc>
+          <w:tcPr>
+            <w:tcW w:type="dxa" w:w="397"/>
+            <w:shd w:val="clear" w:color="auto" w:fill="DCE6F1"/>
+          </w:tcPr>
+          <w:p>
+            <w:r/>
+            <w:r>
+              <w:rPr>
+                <w:b/>
+              </w:rPr>
+              <w:t>№</w:t>
+            </w:r>
+          </w:p>
+        </w:tc>
+        <w:tc>
+          <w:tcPr>
+            <w:tcW w:type="dxa" w:w="1814"/>
+            <w:shd w:val="clear" w:color="auto" w:fill="DCE6F1"/>
+          </w:tcPr>
+          <w:p>
+            <w:r/>
+            <w:r>
+              <w:rPr>
+                <w:b/>
+              </w:rPr>
+              <w:t>Заголовок</w:t>
+            </w:r>
+          </w:p>
+        </w:tc>
+        <w:tc>
+          <w:tcPr>
+            <w:tcW w:type="dxa" w:w="567"/>
+            <w:shd w:val="clear" w:color="auto" w:fill="DCE6F1"/>
+          </w:tcPr>
+          <w:p>
+            <w:r/>
+            <w:r>
+              <w:rPr>
+                <w:b/>
+              </w:rPr>
+              <w:t>Симв.</w:t>
+            </w:r>
+          </w:p>
+        </w:tc>
+        <w:tc>
+          <w:tcPr>
+            <w:tcW w:type="dxa" w:w="2494"/>
+            <w:shd w:val="clear" w:color="auto" w:fill="DCE6F1"/>
+          </w:tcPr>
+          <w:p>
+            <w:r/>
+            <w:r>
+              <w:rPr>
+                <w:b/>
+              </w:rPr>
+              <w:t>Описание</w:t>
+            </w:r>
+          </w:p>
+        </w:tc>
+        <w:tc>
+          <w:tcPr>
+            <w:tcW w:type="dxa" w:w="567"/>
+            <w:shd w:val="clear" w:color="auto" w:fill="DCE6F1"/>
+          </w:tcPr>
+          <w:p>
+            <w:r/>
+            <w:r>
+              <w:rPr>
+                <w:b/>
+              </w:rPr>
+              <w:t>Симв.</w:t>
+            </w:r>
+          </w:p>
+        </w:tc>
+        <w:tc>
+          <w:tcPr>
+            <w:tcW w:type="dxa" w:w="2154"/>
+            <w:shd w:val="clear" w:color="auto" w:fill="DCE6F1"/>
+          </w:tcPr>
+          <w:p>
+            <w:r/>
+            <w:r>
+              <w:rPr>
+                <w:b/>
+              </w:rPr>
+              <w:t>Ссылка (+UTM кампании)</w:t>
+            </w:r>
+          </w:p>
+        </w:tc>
+        <w:tc>
+          <w:tcPr>
+            <w:tcW w:type="dxa" w:w="1928"/>
+            <w:shd w:val="clear" w:color="auto" w:fill="DCE6F1"/>
+          </w:tcPr>
+          <w:p>
+            <w:r/>
+            <w:r>
+              <w:rPr>
+                <w:b/>
+              </w:rPr>
+              <w:t>Куда ставить</w:t>
+            </w:r>
+          </w:p>
+        </w:tc>
+      </w:tr>
+      <w:tr>
+        <w:tc>
+          <w:tcPr>
+            <w:tcW w:type="dxa" w:w="397"/>
+          </w:tcPr>
+          <w:p>
+            <w:r>
+              <w:t>9</w:t>
+            </w:r>
+          </w:p>
+        </w:tc>
+        <w:tc>
+          <w:tcPr>
+            <w:tcW w:type="dxa" w:w="1814"/>
+          </w:tcPr>
+          <w:p>
+            <w:r>
+              <w:t>Без праздничной наценки</w:t>
+            </w:r>
+          </w:p>
+        </w:tc>
+        <w:tc>
+          <w:tcPr>
+            <w:tcW w:type="dxa" w:w="567"/>
+          </w:tcPr>
+          <w:p>
+            <w:r>
+              <w:t>23</w:t>
+            </w:r>
+          </w:p>
+        </w:tc>
+        <w:tc>
+          <w:tcPr>
+            <w:tcW w:type="dxa" w:w="2494"/>
+          </w:tcPr>
+          <w:p>
+            <w:r>
+              <w:t>Цена за всё судно в январе — как в обычные дни</w:t>
+            </w:r>
+          </w:p>
+        </w:tc>
+        <w:tc>
+          <w:tcPr>
+            <w:tcW w:type="dxa" w:w="567"/>
+          </w:tcPr>
+          <w:p>
+            <w:r>
+              <w:t>46</w:t>
+            </w:r>
+          </w:p>
+        </w:tc>
+        <w:tc>
+          <w:tcPr>
+            <w:tcW w:type="dxa" w:w="2154"/>
+          </w:tcPr>
+          <w:p>
+            <w:r>
+              <w:t>https://boat-sochi.ru/yachts_ny?sl=9#yachts</w:t>
+            </w:r>
+          </w:p>
+        </w:tc>
+        <w:tc>
+          <w:tcPr>
+            <w:tcW w:type="dxa" w:w="1928"/>
+          </w:tcPr>
+          <w:p>
+            <w:r>
+              <w:t>вместо №5 «Как проходит бронь» — дублирует №4</w:t>
+            </w:r>
+          </w:p>
+        </w:tc>
+      </w:tr>
+      <w:tr>
+        <w:tc>
+          <w:tcPr>
+            <w:tcW w:type="dxa" w:w="397"/>
+          </w:tcPr>
+          <w:p>
+            <w:r>
+              <w:t>10</w:t>
+            </w:r>
+          </w:p>
+        </w:tc>
+        <w:tc>
+          <w:tcPr>
+            <w:tcW w:type="dxa" w:w="1814"/>
+          </w:tcPr>
+          <w:p>
+            <w:r>
+              <w:t>Прогулка с детьми</w:t>
+            </w:r>
+          </w:p>
+        </w:tc>
+        <w:tc>
+          <w:tcPr>
+            <w:tcW w:type="dxa" w:w="567"/>
+          </w:tcPr>
+          <w:p>
+            <w:r>
+              <w:t>17</w:t>
+            </w:r>
+          </w:p>
+        </w:tc>
+        <w:tc>
+          <w:tcPr>
+            <w:tcW w:type="dxa" w:w="2494"/>
+          </w:tcPr>
+          <w:p>
+            <w:r>
+              <w:t>Дети считаются в число гостей: катер до 7, яхта до 11</w:t>
+            </w:r>
+          </w:p>
+        </w:tc>
+        <w:tc>
+          <w:tcPr>
+            <w:tcW w:type="dxa" w:w="567"/>
+          </w:tcPr>
+          <w:p>
+            <w:r>
+              <w:t>53</w:t>
+            </w:r>
+          </w:p>
+        </w:tc>
+        <w:tc>
+          <w:tcPr>
+            <w:tcW w:type="dxa" w:w="2154"/>
+          </w:tcPr>
+          <w:p>
+            <w:r>
+              <w:t>https://boat-sochi.ru/yachts_ny?sl=10#yachts</w:t>
+            </w:r>
+          </w:p>
+        </w:tc>
+        <w:tc>
+          <w:tcPr>
+            <w:tcW w:type="dxa" w:w="1928"/>
+          </w:tcPr>
+          <w:p>
+            <w:r>
+              <w:t>вместо №7 «Оплата по счёту» — на каникулах едут семьи, а не юрлица</w:t>
             </w:r>
           </w:p>
         </w:tc>

</xml_diff>

<commit_message>
EPK /yachts_ny: single group G1 (NY tourists) at launch
Co-authored-by: Igor-Lark <Igor-Lark@users.noreply.github.com>
</commit_message>
<xml_diff>
--- a/reklama/EPK_yachts_ny_NG2027_zima.docx
+++ b/reklama/EPK_yachts_ny_NG2027_zima.docx
@@ -7,7 +7,7 @@
         <w:pStyle w:val="Title"/>
       </w:pPr>
       <w:r>
-        <w:t>ЕПК «Яхты НГ 2027 + зима · РСЯ» — настройки кампании, групп и объявлений</w:t>
+        <w:t>ЕПК «Яхты НГ 2027 + зима · РСЯ» — настройки кампании, группы и объявлений</w:t>
       </w:r>
     </w:p>
     <w:p>
@@ -25,7 +25,7 @@
           <w:b w:val="0"/>
           <w:i/>
         </w:rPr>
-        <w:t>Подготовлено 29.10.2026, обновлено 30.10.2026 (3 группы, без лыжников и ретаргетинга). Документ — настройки для ручной заливки. В Директе ничего не создано и не изменено.</w:t>
+        <w:t>Подготовлено 29.10.2026, обновлено 31.10.2026: на старте одна группа — туристы, планирующие НГ в Сочи и Сириусе. Документ — настройки для ручной заливки. В Директе ничего не создано и не изменено.</w:t>
       </w:r>
     </w:p>
     <w:p>
@@ -57,7 +57,7 @@
         <w:pStyle w:val="ListBullet"/>
       </w:pPr>
       <w:r>
-        <w:t>3 группы по аудиториям: туристы, планирующие НГ в Сочи; гости Сириуса/Имеретинки; прогулка под парусом 1 800 ₽.</w:t>
+        <w:t>На старте ОДНА группа G1 — туристы по всей России, которые планируют новогодние каникулы в Сочи и Сириусе. Группы «Гости Сириуса» и «Парусник» запускаем ближе к НГ, их настройки — отдельно.</w:t>
       </w:r>
     </w:p>
     <w:p>
@@ -81,7 +81,7 @@
         <w:pStyle w:val="ListBullet"/>
       </w:pPr>
       <w:r>
-        <w:t>Период: запуск 01.11.2026 → активная фаза до 10.01.2027 → зима 11.01–28.02.2027 (посадочная всё время /yachts_ny, с 11.01 обновить на ней тексты, см. раздел 7).</w:t>
+        <w:t>Период: запуск 01.11.2026 → активная фаза до 10.01.2027 → зима 11.01–28.02.2027 (посадочная всё время /yachts_ny, с 11.01 обновить на ней тексты, см. раздел 4).</w:t>
       </w:r>
     </w:p>
     <w:p>
@@ -277,7 +277,7 @@
           </w:tcPr>
           <w:p>
             <w:r>
-              <w:t>С 11.01 — смена текстов, посадочная та же (раздел 7)</w:t>
+              <w:t>С 11.01 — смена текстов, посадочная та же (раздел 4)</w:t>
             </w:r>
           </w:p>
         </w:tc>
@@ -1294,7 +1294,7 @@
           </w:tcPr>
           <w:p>
             <w:r>
-              <w:t>+20% (в группах с гео «Россия»)</w:t>
+              <w:t>+20%</w:t>
             </w:r>
           </w:p>
         </w:tc>
@@ -1639,7 +1639,7 @@
           <w:b w:val="0"/>
           <w:i w:val="0"/>
         </w:rPr>
-        <w:t>Вместо G1 — код группы (G1…G3). В лыжной ЕПК — свой utm_campaign, чтобы статистика не смешивалась. {source} покажет площадку РСЯ в Метрике — по ней чистим стоп-лист.</w:t>
+        <w:t>G1 — код группы; новые группы ближе к НГ получат свои коды. В лыжной ЕПК — свой utm_campaign, чтобы статистика не смешивалась. {source} покажет площадку РСЯ в Метрике — по ней чистим стоп-лист.</w:t>
       </w:r>
     </w:p>
     <w:p>
@@ -1647,7 +1647,7 @@
         <w:pStyle w:val="Heading1"/>
       </w:pPr>
       <w:r>
-        <w:t>2. Структура групп</w:t>
+        <w:t>2. Группа и общие настройки</w:t>
       </w:r>
     </w:p>
     <w:tbl>
@@ -1804,130 +1804,6 @@
           <w:p>
             <w:r>
               <w:t>Ключи-сигналы + автотаргетинг</w:t>
-            </w:r>
-          </w:p>
-        </w:tc>
-        <w:tc>
-          <w:tcPr>
-            <w:tcW w:type="dxa" w:w="1701"/>
-          </w:tcPr>
-          <w:p>
-            <w:r>
-              <w:t>https://boat-sochi.ru/yachts_ny</w:t>
-            </w:r>
-          </w:p>
-        </w:tc>
-      </w:tr>
-      <w:tr>
-        <w:tc>
-          <w:tcPr>
-            <w:tcW w:type="dxa" w:w="567"/>
-          </w:tcPr>
-          <w:p>
-            <w:r>
-              <w:t>G2</w:t>
-            </w:r>
-          </w:p>
-        </w:tc>
-        <w:tc>
-          <w:tcPr>
-            <w:tcW w:type="dxa" w:w="1984"/>
-          </w:tcPr>
-          <w:p>
-            <w:r>
-              <w:t>НГ · Гости Сириуса и Имеретинки</w:t>
-            </w:r>
-          </w:p>
-        </w:tc>
-        <w:tc>
-          <w:tcPr>
-            <w:tcW w:type="dxa" w:w="2268"/>
-          </w:tcPr>
-          <w:p>
-            <w:r>
-              <w:t>Уже живут в отелях у моря</w:t>
-            </w:r>
-          </w:p>
-        </w:tc>
-        <w:tc>
-          <w:tcPr>
-            <w:tcW w:type="dxa" w:w="1701"/>
-          </w:tcPr>
-          <w:p>
-            <w:r>
-              <w:t>ФТ Сириус, Адлерский р-н</w:t>
-            </w:r>
-          </w:p>
-        </w:tc>
-        <w:tc>
-          <w:tcPr>
-            <w:tcW w:type="dxa" w:w="1701"/>
-          </w:tcPr>
-          <w:p>
-            <w:r>
-              <w:t>Ключи + сегменты отелей</w:t>
-            </w:r>
-          </w:p>
-        </w:tc>
-        <w:tc>
-          <w:tcPr>
-            <w:tcW w:type="dxa" w:w="1701"/>
-          </w:tcPr>
-          <w:p>
-            <w:r>
-              <w:t>https://boat-sochi.ru/yachts_ny</w:t>
-            </w:r>
-          </w:p>
-        </w:tc>
-      </w:tr>
-      <w:tr>
-        <w:tc>
-          <w:tcPr>
-            <w:tcW w:type="dxa" w:w="567"/>
-          </w:tcPr>
-          <w:p>
-            <w:r>
-              <w:t>G3</w:t>
-            </w:r>
-          </w:p>
-        </w:tc>
-        <w:tc>
-          <w:tcPr>
-            <w:tcW w:type="dxa" w:w="1984"/>
-          </w:tcPr>
-          <w:p>
-            <w:r>
-              <w:t>НГ · Под парусом 1 800 ₽</w:t>
-            </w:r>
-          </w:p>
-        </w:tc>
-        <w:tc>
-          <w:tcPr>
-            <w:tcW w:type="dxa" w:w="2268"/>
-          </w:tcPr>
-          <w:p>
-            <w:r>
-              <w:t>Хотят недорогую прогулку</w:t>
-            </w:r>
-          </w:p>
-        </w:tc>
-        <w:tc>
-          <w:tcPr>
-            <w:tcW w:type="dxa" w:w="1701"/>
-          </w:tcPr>
-          <w:p>
-            <w:r>
-              <w:t>Сочи + ФТ Сириус + Россия</w:t>
-            </w:r>
-          </w:p>
-        </w:tc>
-        <w:tc>
-          <w:tcPr>
-            <w:tcW w:type="dxa" w:w="1701"/>
-          </w:tcPr>
-          <w:p>
-            <w:r>
-              <w:t>Ключи</w:t>
             </w:r>
           </w:p>
         </w:tc>
@@ -1959,7 +1835,7 @@
           <w:b/>
           <w:i w:val="0"/>
         </w:rPr>
-        <w:t>Общее для всех групп:</w:t>
+        <w:t>Общие настройки группы:</w:t>
       </w:r>
     </w:p>
     <w:p>
@@ -1991,7 +1867,7 @@
         <w:pStyle w:val="ListBullet"/>
       </w:pPr>
       <w:r>
-        <w:t>Расширенный географический таргетинг — ВКЛ (кроме G2).</w:t>
+        <w:t>Расширенный географический таргетинг — ВКЛ.</w:t>
       </w:r>
     </w:p>
     <w:p>
@@ -1999,7 +1875,7 @@
         <w:pStyle w:val="ListBullet"/>
       </w:pPr>
       <w:r>
-        <w:t>В каждой группе 1 объявление ЕПК (комбинаторное) + при желании 2-е объявление с другим набором креативов для A/B.</w:t>
+        <w:t>1 объявление ЕПК (комбинаторное) + при желании 2-е объявление с другим набором креативов для A/B.</w:t>
       </w:r>
     </w:p>
     <w:p>
@@ -2134,7 +2010,7 @@
           </w:tcPr>
           <w:p>
             <w:r>
-              <w:t>Интересы (доп.)</w:t>
+              <w:t>Интересы и привычки</w:t>
             </w:r>
           </w:p>
         </w:tc>
@@ -2144,7 +2020,7 @@
           </w:tcPr>
           <w:p>
             <w:r>
-              <w:t>Путешествия → Туризм по России; Отдых на море</w:t>
+              <w:t>НЕ добавлять. Условия в группе работают через «ИЛИ»: интерес не сужает ключи, а добавляет отдельный поток показов. «Туризм» по всей России — это почти все, то есть широкий трафик без намерения ехать в Сочи. Если через 2–3 недели не хватает показов — тестировать интересы отдельной группой, а не в G1</w:t>
             </w:r>
           </w:p>
         </w:tc>
@@ -2694,183 +2570,7 @@
         <w:pStyle w:val="Heading1"/>
       </w:pPr>
       <w:r>
-        <w:t>G2. НГ · Гости Сириуса и Имеретинки</w:t>
-      </w:r>
-    </w:p>
-    <w:p>
-      <w:r>
-        <w:rPr>
-          <w:b w:val="0"/>
-          <w:i w:val="0"/>
-        </w:rPr>
-        <w:t>Те, кто уже живёт в отелях Имеретинского курорта на каникулах. Им не нужно ехать — достаточно дойти до порта.</w:t>
-      </w:r>
-    </w:p>
-    <w:tbl>
-      <w:tblPr>
-        <w:tblStyle w:val="TableGrid"/>
-        <w:tblW w:type="auto" w:w="0"/>
-        <w:tblLook w:firstColumn="1" w:firstRow="1" w:lastColumn="0" w:lastRow="0" w:noHBand="0" w:noVBand="1" w:val="04A0"/>
-      </w:tblPr>
-      <w:tblGrid>
-        <w:gridCol w:w="5100"/>
-        <w:gridCol w:w="5100"/>
-      </w:tblGrid>
-      <w:tr>
-        <w:tc>
-          <w:tcPr>
-            <w:tcW w:type="dxa" w:w="2835"/>
-            <w:shd w:val="clear" w:color="auto" w:fill="DCE6F1"/>
-          </w:tcPr>
-          <w:p>
-            <w:r/>
-            <w:r>
-              <w:rPr>
-                <w:b/>
-              </w:rPr>
-              <w:t>Настройка</w:t>
-            </w:r>
-          </w:p>
-        </w:tc>
-        <w:tc>
-          <w:tcPr>
-            <w:tcW w:type="dxa" w:w="7087"/>
-            <w:shd w:val="clear" w:color="auto" w:fill="DCE6F1"/>
-          </w:tcPr>
-          <w:p>
-            <w:r/>
-            <w:r>
-              <w:rPr>
-                <w:b/>
-              </w:rPr>
-              <w:t>Значение</w:t>
-            </w:r>
-          </w:p>
-        </w:tc>
-      </w:tr>
-      <w:tr>
-        <w:tc>
-          <w:tcPr>
-            <w:tcW w:type="dxa" w:w="2835"/>
-          </w:tcPr>
-          <w:p>
-            <w:r>
-              <w:t>Гео</w:t>
-            </w:r>
-          </w:p>
-        </w:tc>
-        <w:tc>
-          <w:tcPr>
-            <w:tcW w:type="dxa" w:w="7087"/>
-          </w:tcPr>
-          <w:p>
-            <w:r>
-              <w:t>Федеральная территория Сириус + Адлерский район. Расширенный гео — ВЫКЛ</w:t>
-            </w:r>
-          </w:p>
-        </w:tc>
-      </w:tr>
-      <w:tr>
-        <w:tc>
-          <w:tcPr>
-            <w:tcW w:type="dxa" w:w="2835"/>
-          </w:tcPr>
-          <w:p>
-            <w:r>
-              <w:t>Сегменты</w:t>
-            </w:r>
-          </w:p>
-        </w:tc>
-        <w:tc>
-          <w:tcPr>
-            <w:tcW w:type="dxa" w:w="7087"/>
-          </w:tcPr>
-          <w:p>
-            <w:r>
-              <w:t>Уже есть в аккаунте: «Mantera Suprime N дней за 3 мес.» (ID 60551369, 60564990, 60565007 и др.) — подключить без look-alike. Дополнительно — полигоны отелей Имеретинки (Mantera Suprime, Mantera Resort &amp; Congress, «Бархатные сезоны», «Сочи Парк Отель», Delta Sirius и др.), тип «Сейчас находятся / регулярно посещают», 7 дней</w:t>
-            </w:r>
-          </w:p>
-        </w:tc>
-      </w:tr>
-      <w:tr>
-        <w:tc>
-          <w:tcPr>
-            <w:tcW w:type="dxa" w:w="2835"/>
-          </w:tcPr>
-          <w:p>
-            <w:r>
-              <w:t>Корректировка</w:t>
-            </w:r>
-          </w:p>
-        </w:tc>
-        <w:tc>
-          <w:tcPr>
-            <w:tcW w:type="dxa" w:w="7087"/>
-          </w:tcPr>
-          <w:p>
-            <w:r>
-              <w:t>Платёжеспособность топ 1–5% — как на кампании</w:t>
-            </w:r>
-          </w:p>
-        </w:tc>
-      </w:tr>
-      <w:tr>
-        <w:tc>
-          <w:tcPr>
-            <w:tcW w:type="dxa" w:w="2835"/>
-          </w:tcPr>
-          <w:p>
-            <w:r>
-              <w:t>Автотаргетинг</w:t>
-            </w:r>
-          </w:p>
-        </w:tc>
-        <w:tc>
-          <w:tcPr>
-            <w:tcW w:type="dxa" w:w="7087"/>
-          </w:tcPr>
-          <w:p>
-            <w:r>
-              <w:t>Целевые + узкие</w:t>
-            </w:r>
-          </w:p>
-        </w:tc>
-      </w:tr>
-    </w:tbl>
-    <w:p/>
-    <w:p>
-      <w:pPr>
-        <w:pStyle w:val="Heading2"/>
-      </w:pPr>
-      <w:r>
-        <w:t>Ключевые фразы (сигналы аудитории в РСЯ)</w:t>
-      </w:r>
-    </w:p>
-    <w:p>
-      <w:r>
-        <w:rPr>
-          <w:rFonts w:ascii="Consolas" w:hAnsi="Consolas"/>
-          <w:sz w:val="19"/>
-        </w:rPr>
-        <w:t>что посмотреть в сириусе</w:t>
-        <w:br/>
-        <w:t>куда сходить в сириусе</w:t>
-        <w:br/>
-        <w:t>сириус чем заняться зимой</w:t>
-        <w:br/>
-        <w:t>отдых в сириусе зимой</w:t>
-        <w:br/>
-        <w:t>олимпийский парк сочи</w:t>
-        <w:br/>
-        <w:t>сочи парк</w:t>
-        <w:br/>
-        <w:t>имеретинская набережная</w:t>
-        <w:br/>
-        <w:t>экскурсии сириус</w:t>
-        <w:br/>
-        <w:t>мантера сириус</w:t>
-        <w:br/>
-        <w:t>морская прогулка сириус</w:t>
+        <w:t>3. Расширения</w:t>
       </w:r>
     </w:p>
     <w:p>
@@ -2878,1093 +2578,7 @@
         <w:pStyle w:val="Heading2"/>
       </w:pPr>
       <w:r>
-        <w:t>Объявление ЕПК</w:t>
-      </w:r>
-    </w:p>
-    <w:p>
-      <w:r>
-        <w:rPr>
-          <w:b/>
-          <w:i w:val="0"/>
-        </w:rPr>
-        <w:t>Заголовки (до 56 символов, можно до 7):</w:t>
-      </w:r>
-    </w:p>
-    <w:tbl>
-      <w:tblPr>
-        <w:tblStyle w:val="TableGrid"/>
-        <w:tblW w:type="auto" w:w="0"/>
-        <w:tblLook w:firstColumn="1" w:firstRow="1" w:lastColumn="0" w:lastRow="0" w:noHBand="0" w:noVBand="1" w:val="04A0"/>
-      </w:tblPr>
-      <w:tblGrid>
-        <w:gridCol w:w="3400"/>
-        <w:gridCol w:w="3400"/>
-        <w:gridCol w:w="3400"/>
-      </w:tblGrid>
-      <w:tr>
-        <w:tc>
-          <w:tcPr>
-            <w:tcW w:type="dxa" w:w="567"/>
-            <w:shd w:val="clear" w:color="auto" w:fill="DCE6F1"/>
-          </w:tcPr>
-          <w:p>
-            <w:r/>
-            <w:r>
-              <w:rPr>
-                <w:b/>
-              </w:rPr>
-              <w:t>№</w:t>
-            </w:r>
-          </w:p>
-        </w:tc>
-        <w:tc>
-          <w:tcPr>
-            <w:tcW w:type="dxa" w:w="7937"/>
-            <w:shd w:val="clear" w:color="auto" w:fill="DCE6F1"/>
-          </w:tcPr>
-          <w:p>
-            <w:r/>
-            <w:r>
-              <w:rPr>
-                <w:b/>
-              </w:rPr>
-              <w:t>Заголовок</w:t>
-            </w:r>
-          </w:p>
-        </w:tc>
-        <w:tc>
-          <w:tcPr>
-            <w:tcW w:type="dxa" w:w="1417"/>
-            <w:shd w:val="clear" w:color="auto" w:fill="DCE6F1"/>
-          </w:tcPr>
-          <w:p>
-            <w:r/>
-            <w:r>
-              <w:rPr>
-                <w:b/>
-              </w:rPr>
-              <w:t>Символов</w:t>
-            </w:r>
-          </w:p>
-        </w:tc>
-      </w:tr>
-      <w:tr>
-        <w:tc>
-          <w:tcPr>
-            <w:tcW w:type="dxa" w:w="567"/>
-          </w:tcPr>
-          <w:p>
-            <w:r>
-              <w:t>1</w:t>
-            </w:r>
-          </w:p>
-        </w:tc>
-        <w:tc>
-          <w:tcPr>
-            <w:tcW w:type="dxa" w:w="7937"/>
-          </w:tcPr>
-          <w:p>
-            <w:r>
-              <w:t>Морская прогулка в Сириусе на каникулах</w:t>
-            </w:r>
-          </w:p>
-        </w:tc>
-        <w:tc>
-          <w:tcPr>
-            <w:tcW w:type="dxa" w:w="1417"/>
-          </w:tcPr>
-          <w:p>
-            <w:r>
-              <w:t>39</w:t>
-            </w:r>
-          </w:p>
-        </w:tc>
-      </w:tr>
-      <w:tr>
-        <w:tc>
-          <w:tcPr>
-            <w:tcW w:type="dxa" w:w="567"/>
-          </w:tcPr>
-          <w:p>
-            <w:r>
-              <w:t>2</w:t>
-            </w:r>
-          </w:p>
-        </w:tc>
-        <w:tc>
-          <w:tcPr>
-            <w:tcW w:type="dxa" w:w="7937"/>
-          </w:tcPr>
-          <w:p>
-            <w:r>
-              <w:t>Чем заняться в Сириусе зимой — выйти в море</w:t>
-            </w:r>
-          </w:p>
-        </w:tc>
-        <w:tc>
-          <w:tcPr>
-            <w:tcW w:type="dxa" w:w="1417"/>
-          </w:tcPr>
-          <w:p>
-            <w:r>
-              <w:t>43</w:t>
-            </w:r>
-          </w:p>
-        </w:tc>
-      </w:tr>
-      <w:tr>
-        <w:tc>
-          <w:tcPr>
-            <w:tcW w:type="dxa" w:w="567"/>
-          </w:tcPr>
-          <w:p>
-            <w:r>
-              <w:t>3</w:t>
-            </w:r>
-          </w:p>
-        </w:tc>
-        <w:tc>
-          <w:tcPr>
-            <w:tcW w:type="dxa" w:w="7937"/>
-          </w:tcPr>
-          <w:p>
-            <w:r>
-              <w:t>Яхта в Имеретинском порту: 1–10 января</w:t>
-            </w:r>
-          </w:p>
-        </w:tc>
-        <w:tc>
-          <w:tcPr>
-            <w:tcW w:type="dxa" w:w="1417"/>
-          </w:tcPr>
-          <w:p>
-            <w:r>
-              <w:t>38</w:t>
-            </w:r>
-          </w:p>
-        </w:tc>
-      </w:tr>
-      <w:tr>
-        <w:tc>
-          <w:tcPr>
-            <w:tcW w:type="dxa" w:w="567"/>
-          </w:tcPr>
-          <w:p>
-            <w:r>
-              <w:t>4</w:t>
-            </w:r>
-          </w:p>
-        </w:tc>
-        <w:tc>
-          <w:tcPr>
-            <w:tcW w:type="dxa" w:w="7937"/>
-          </w:tcPr>
-          <w:p>
-            <w:r>
-              <w:t>Катер «Сириус» — 8 000 ₽ за час, до 7 гостей</w:t>
-            </w:r>
-          </w:p>
-        </w:tc>
-        <w:tc>
-          <w:tcPr>
-            <w:tcW w:type="dxa" w:w="1417"/>
-          </w:tcPr>
-          <w:p>
-            <w:r>
-              <w:t>44</w:t>
-            </w:r>
-          </w:p>
-        </w:tc>
-      </w:tr>
-      <w:tr>
-        <w:tc>
-          <w:tcPr>
-            <w:tcW w:type="dxa" w:w="567"/>
-          </w:tcPr>
-          <w:p>
-            <w:r>
-              <w:t>5</w:t>
-            </w:r>
-          </w:p>
-        </w:tc>
-        <w:tc>
-          <w:tcPr>
-            <w:tcW w:type="dxa" w:w="7937"/>
-          </w:tcPr>
-          <w:p>
-            <w:r>
-              <w:t>Яхта «Бруно» — 14 500 ₽ за час, до 11 гостей</w:t>
-            </w:r>
-          </w:p>
-        </w:tc>
-        <w:tc>
-          <w:tcPr>
-            <w:tcW w:type="dxa" w:w="1417"/>
-          </w:tcPr>
-          <w:p>
-            <w:r>
-              <w:t>44</w:t>
-            </w:r>
-          </w:p>
-        </w:tc>
-      </w:tr>
-      <w:tr>
-        <w:tc>
-          <w:tcPr>
-            <w:tcW w:type="dxa" w:w="567"/>
-          </w:tcPr>
-          <w:p>
-            <w:r>
-              <w:t>6</w:t>
-            </w:r>
-          </w:p>
-        </w:tc>
-        <w:tc>
-          <w:tcPr>
-            <w:tcW w:type="dxa" w:w="7937"/>
-          </w:tcPr>
-          <w:p>
-            <w:r>
-              <w:t>Прогулка под парусом — 1 800 ₽ с человека</w:t>
-            </w:r>
-          </w:p>
-        </w:tc>
-        <w:tc>
-          <w:tcPr>
-            <w:tcW w:type="dxa" w:w="1417"/>
-          </w:tcPr>
-          <w:p>
-            <w:r>
-              <w:t>41</w:t>
-            </w:r>
-          </w:p>
-        </w:tc>
-      </w:tr>
-      <w:tr>
-        <w:tc>
-          <w:tcPr>
-            <w:tcW w:type="dxa" w:w="567"/>
-          </w:tcPr>
-          <w:p>
-            <w:r>
-              <w:t>7</w:t>
-            </w:r>
-          </w:p>
-        </w:tc>
-        <w:tc>
-          <w:tcPr>
-            <w:tcW w:type="dxa" w:w="7937"/>
-          </w:tcPr>
-          <w:p>
-            <w:r>
-              <w:t>Вы в Сириусе? Море и горы с палубы яхты</w:t>
-            </w:r>
-          </w:p>
-        </w:tc>
-        <w:tc>
-          <w:tcPr>
-            <w:tcW w:type="dxa" w:w="1417"/>
-          </w:tcPr>
-          <w:p>
-            <w:r>
-              <w:t>39</w:t>
-            </w:r>
-          </w:p>
-        </w:tc>
-      </w:tr>
-    </w:tbl>
-    <w:p/>
-    <w:p>
-      <w:r>
-        <w:rPr>
-          <w:b/>
-          <w:i w:val="0"/>
-        </w:rPr>
-        <w:t>Тексты (до 81 символа, можно до 3):</w:t>
-      </w:r>
-    </w:p>
-    <w:tbl>
-      <w:tblPr>
-        <w:tblStyle w:val="TableGrid"/>
-        <w:tblW w:type="auto" w:w="0"/>
-        <w:tblLook w:firstColumn="1" w:firstRow="1" w:lastColumn="0" w:lastRow="0" w:noHBand="0" w:noVBand="1" w:val="04A0"/>
-      </w:tblPr>
-      <w:tblGrid>
-        <w:gridCol w:w="3400"/>
-        <w:gridCol w:w="3400"/>
-        <w:gridCol w:w="3400"/>
-      </w:tblGrid>
-      <w:tr>
-        <w:tc>
-          <w:tcPr>
-            <w:tcW w:type="dxa" w:w="567"/>
-            <w:shd w:val="clear" w:color="auto" w:fill="DCE6F1"/>
-          </w:tcPr>
-          <w:p>
-            <w:r/>
-            <w:r>
-              <w:rPr>
-                <w:b/>
-              </w:rPr>
-              <w:t>№</w:t>
-            </w:r>
-          </w:p>
-        </w:tc>
-        <w:tc>
-          <w:tcPr>
-            <w:tcW w:type="dxa" w:w="7937"/>
-            <w:shd w:val="clear" w:color="auto" w:fill="DCE6F1"/>
-          </w:tcPr>
-          <w:p>
-            <w:r/>
-            <w:r>
-              <w:rPr>
-                <w:b/>
-              </w:rPr>
-              <w:t>Текст</w:t>
-            </w:r>
-          </w:p>
-        </w:tc>
-        <w:tc>
-          <w:tcPr>
-            <w:tcW w:type="dxa" w:w="1417"/>
-            <w:shd w:val="clear" w:color="auto" w:fill="DCE6F1"/>
-          </w:tcPr>
-          <w:p>
-            <w:r/>
-            <w:r>
-              <w:rPr>
-                <w:b/>
-              </w:rPr>
-              <w:t>Символов</w:t>
-            </w:r>
-          </w:p>
-        </w:tc>
-      </w:tr>
-      <w:tr>
-        <w:tc>
-          <w:tcPr>
-            <w:tcW w:type="dxa" w:w="567"/>
-          </w:tcPr>
-          <w:p>
-            <w:r>
-              <w:t>1</w:t>
-            </w:r>
-          </w:p>
-        </w:tc>
-        <w:tc>
-          <w:tcPr>
-            <w:tcW w:type="dxa" w:w="7937"/>
-          </w:tcPr>
-          <w:p>
-            <w:r>
-              <w:t>Посадка в Имеретинском порту, линия 1. Бронь на 1–10 января без предоплаты.</w:t>
-            </w:r>
-          </w:p>
-        </w:tc>
-        <w:tc>
-          <w:tcPr>
-            <w:tcW w:type="dxa" w:w="1417"/>
-          </w:tcPr>
-          <w:p>
-            <w:r>
-              <w:t>75</w:t>
-            </w:r>
-          </w:p>
-        </w:tc>
-      </w:tr>
-      <w:tr>
-        <w:tc>
-          <w:tcPr>
-            <w:tcW w:type="dxa" w:w="567"/>
-          </w:tcPr>
-          <w:p>
-            <w:r>
-              <w:t>2</w:t>
-            </w:r>
-          </w:p>
-        </w:tc>
-        <w:tc>
-          <w:tcPr>
-            <w:tcW w:type="dxa" w:w="7937"/>
-          </w:tcPr>
-          <w:p>
-            <w:r>
-              <w:t>Катер, круизная яхта или парусник. Цена за всё судно, без наценки на праздники.</w:t>
-            </w:r>
-          </w:p>
-        </w:tc>
-        <w:tc>
-          <w:tcPr>
-            <w:tcW w:type="dxa" w:w="1417"/>
-          </w:tcPr>
-          <w:p>
-            <w:r>
-              <w:t>79</w:t>
-            </w:r>
-          </w:p>
-        </w:tc>
-      </w:tr>
-      <w:tr>
-        <w:tc>
-          <w:tcPr>
-            <w:tcW w:type="dxa" w:w="567"/>
-          </w:tcPr>
-          <w:p>
-            <w:r>
-              <w:t>3</w:t>
-            </w:r>
-          </w:p>
-        </w:tc>
-        <w:tc>
-          <w:tcPr>
-            <w:tcW w:type="dxa" w:w="7937"/>
-          </w:tcPr>
-          <w:p>
-            <w:r>
-              <w:t>Выход подтверждаем по погоде. Капитан на борту, маршрут обсудим с вами.</w:t>
-            </w:r>
-          </w:p>
-        </w:tc>
-        <w:tc>
-          <w:tcPr>
-            <w:tcW w:type="dxa" w:w="1417"/>
-          </w:tcPr>
-          <w:p>
-            <w:r>
-              <w:t>71</w:t>
-            </w:r>
-          </w:p>
-        </w:tc>
-      </w:tr>
-    </w:tbl>
-    <w:p/>
-    <w:p>
-      <w:r>
-        <w:rPr>
-          <w:b w:val="0"/>
-          <w:i w:val="0"/>
-        </w:rPr>
-        <w:t>Ссылка: https://boat-sochi.ru/yachts_ny?utm_source=yandex&amp;utm_medium=cpc&amp;utm_campaign=epk_yachts_ny&amp;utm_content=G2_{ad_id}&amp;utm_term={keyword}&amp;site={source}</w:t>
-      </w:r>
-    </w:p>
-    <w:p>
-      <w:r>
-        <w:rPr>
-          <w:b w:val="0"/>
-          <w:i w:val="0"/>
-        </w:rPr>
-        <w:t>Цена в объявлении: от 1 800 ₽. Кнопка: «Забронировать».</w:t>
-      </w:r>
-    </w:p>
-    <w:p>
-      <w:r>
-        <w:rPr>
-          <w:b w:val="0"/>
-          <w:i w:val="0"/>
-        </w:rPr>
-        <w:t>Изображения: Bayliner «Сириус» на фоне гор (16:9, 1:1), парусник с гостями «Новогодние каникулы 2027» (1:1).</w:t>
-      </w:r>
-    </w:p>
-    <w:p>
-      <w:pPr>
-        <w:pStyle w:val="Heading1"/>
-      </w:pPr>
-      <w:r>
-        <w:t>G3. НГ · Прогулка под парусом 1 800 ₽</w:t>
-      </w:r>
-    </w:p>
-    <w:p>
-      <w:r>
-        <w:rPr>
-          <w:b w:val="0"/>
-          <w:i w:val="0"/>
-        </w:rPr>
-        <w:t>Групповая прогулка за человека — массовый продукт. ВНИМАНИЕ: тот же продукт продаёт ЕПК «Групповые прогулки» 713449981 (бюджетный пакет с рыбалкой). На 1–10 января парусник в 713449981 приостановить или убрать из неё новогодние тексты, иначе кампании будут конкурировать за одних и тех же людей.</w:t>
-      </w:r>
-    </w:p>
-    <w:tbl>
-      <w:tblPr>
-        <w:tblStyle w:val="TableGrid"/>
-        <w:tblW w:type="auto" w:w="0"/>
-        <w:tblLook w:firstColumn="1" w:firstRow="1" w:lastColumn="0" w:lastRow="0" w:noHBand="0" w:noVBand="1" w:val="04A0"/>
-      </w:tblPr>
-      <w:tblGrid>
-        <w:gridCol w:w="5100"/>
-        <w:gridCol w:w="5100"/>
-      </w:tblGrid>
-      <w:tr>
-        <w:tc>
-          <w:tcPr>
-            <w:tcW w:type="dxa" w:w="2835"/>
-            <w:shd w:val="clear" w:color="auto" w:fill="DCE6F1"/>
-          </w:tcPr>
-          <w:p>
-            <w:r/>
-            <w:r>
-              <w:rPr>
-                <w:b/>
-              </w:rPr>
-              <w:t>Настройка</w:t>
-            </w:r>
-          </w:p>
-        </w:tc>
-        <w:tc>
-          <w:tcPr>
-            <w:tcW w:type="dxa" w:w="7087"/>
-            <w:shd w:val="clear" w:color="auto" w:fill="DCE6F1"/>
-          </w:tcPr>
-          <w:p>
-            <w:r/>
-            <w:r>
-              <w:rPr>
-                <w:b/>
-              </w:rPr>
-              <w:t>Значение</w:t>
-            </w:r>
-          </w:p>
-        </w:tc>
-      </w:tr>
-      <w:tr>
-        <w:tc>
-          <w:tcPr>
-            <w:tcW w:type="dxa" w:w="2835"/>
-          </w:tcPr>
-          <w:p>
-            <w:r>
-              <w:t>Гео</w:t>
-            </w:r>
-          </w:p>
-        </w:tc>
-        <w:tc>
-          <w:tcPr>
-            <w:tcW w:type="dxa" w:w="7087"/>
-          </w:tcPr>
-          <w:p>
-            <w:r>
-              <w:t>Сочи + ФТ Сириус; Россия с корректировкой −30% (туристы до приезда)</w:t>
-            </w:r>
-          </w:p>
-        </w:tc>
-      </w:tr>
-      <w:tr>
-        <w:tc>
-          <w:tcPr>
-            <w:tcW w:type="dxa" w:w="2835"/>
-          </w:tcPr>
-          <w:p>
-            <w:r>
-              <w:t>Автотаргетинг</w:t>
-            </w:r>
-          </w:p>
-        </w:tc>
-        <w:tc>
-          <w:tcPr>
-            <w:tcW w:type="dxa" w:w="7087"/>
-          </w:tcPr>
-          <w:p>
-            <w:r>
-              <w:t>Целевые + узкие</w:t>
-            </w:r>
-          </w:p>
-        </w:tc>
-      </w:tr>
-      <w:tr>
-        <w:tc>
-          <w:tcPr>
-            <w:tcW w:type="dxa" w:w="2835"/>
-          </w:tcPr>
-          <w:p>
-            <w:r>
-              <w:t>Минус-фразы группы</w:t>
-            </w:r>
-          </w:p>
-        </w:tc>
-        <w:tc>
-          <w:tcPr>
-            <w:tcW w:type="dxa" w:w="7087"/>
-          </w:tcPr>
-          <w:p>
-            <w:r>
-              <w:t>-целиком -индивидуальн -vip -вип -на сутки -посуточно -14500 -бруно</w:t>
-            </w:r>
-          </w:p>
-        </w:tc>
-      </w:tr>
-    </w:tbl>
-    <w:p/>
-    <w:p>
-      <w:pPr>
-        <w:pStyle w:val="Heading2"/>
-      </w:pPr>
-      <w:r>
-        <w:t>Ключевые фразы (сигналы аудитории в РСЯ)</w:t>
-      </w:r>
-    </w:p>
-    <w:p>
-      <w:r>
-        <w:rPr>
-          <w:rFonts w:ascii="Consolas" w:hAnsi="Consolas"/>
-          <w:sz w:val="19"/>
-        </w:rPr>
-        <w:t>прогулка под парусом сочи</w:t>
-        <w:br/>
-        <w:t>прогулка на парусной яхте сириус</w:t>
-        <w:br/>
-        <w:t>морская прогулка сириус</w:t>
-        <w:br/>
-        <w:t>морские прогулки сочи зимой</w:t>
-        <w:br/>
-        <w:t>прогулка на яхте сочи цена</w:t>
-        <w:br/>
-        <w:t>прогулка на яхте адлер</w:t>
-        <w:br/>
-        <w:t>парусная яхта сочи</w:t>
-      </w:r>
-    </w:p>
-    <w:p>
-      <w:pPr>
-        <w:pStyle w:val="Heading2"/>
-      </w:pPr>
-      <w:r>
-        <w:t>Объявление ЕПК</w:t>
-      </w:r>
-    </w:p>
-    <w:p>
-      <w:r>
-        <w:rPr>
-          <w:b/>
-          <w:i w:val="0"/>
-        </w:rPr>
-        <w:t>Заголовки (до 56 символов, можно до 7):</w:t>
-      </w:r>
-    </w:p>
-    <w:tbl>
-      <w:tblPr>
-        <w:tblStyle w:val="TableGrid"/>
-        <w:tblW w:type="auto" w:w="0"/>
-        <w:tblLook w:firstColumn="1" w:firstRow="1" w:lastColumn="0" w:lastRow="0" w:noHBand="0" w:noVBand="1" w:val="04A0"/>
-      </w:tblPr>
-      <w:tblGrid>
-        <w:gridCol w:w="3400"/>
-        <w:gridCol w:w="3400"/>
-        <w:gridCol w:w="3400"/>
-      </w:tblGrid>
-      <w:tr>
-        <w:tc>
-          <w:tcPr>
-            <w:tcW w:type="dxa" w:w="567"/>
-            <w:shd w:val="clear" w:color="auto" w:fill="DCE6F1"/>
-          </w:tcPr>
-          <w:p>
-            <w:r/>
-            <w:r>
-              <w:rPr>
-                <w:b/>
-              </w:rPr>
-              <w:t>№</w:t>
-            </w:r>
-          </w:p>
-        </w:tc>
-        <w:tc>
-          <w:tcPr>
-            <w:tcW w:type="dxa" w:w="7937"/>
-            <w:shd w:val="clear" w:color="auto" w:fill="DCE6F1"/>
-          </w:tcPr>
-          <w:p>
-            <w:r/>
-            <w:r>
-              <w:rPr>
-                <w:b/>
-              </w:rPr>
-              <w:t>Заголовок</w:t>
-            </w:r>
-          </w:p>
-        </w:tc>
-        <w:tc>
-          <w:tcPr>
-            <w:tcW w:type="dxa" w:w="1417"/>
-            <w:shd w:val="clear" w:color="auto" w:fill="DCE6F1"/>
-          </w:tcPr>
-          <w:p>
-            <w:r/>
-            <w:r>
-              <w:rPr>
-                <w:b/>
-              </w:rPr>
-              <w:t>Символов</w:t>
-            </w:r>
-          </w:p>
-        </w:tc>
-      </w:tr>
-      <w:tr>
-        <w:tc>
-          <w:tcPr>
-            <w:tcW w:type="dxa" w:w="567"/>
-          </w:tcPr>
-          <w:p>
-            <w:r>
-              <w:t>1</w:t>
-            </w:r>
-          </w:p>
-        </w:tc>
-        <w:tc>
-          <w:tcPr>
-            <w:tcW w:type="dxa" w:w="7937"/>
-          </w:tcPr>
-          <w:p>
-            <w:r>
-              <w:t>Прогулка под парусом в Сириусе — 1 800 ₽</w:t>
-            </w:r>
-          </w:p>
-        </w:tc>
-        <w:tc>
-          <w:tcPr>
-            <w:tcW w:type="dxa" w:w="1417"/>
-          </w:tcPr>
-          <w:p>
-            <w:r>
-              <w:t>40</w:t>
-            </w:r>
-          </w:p>
-        </w:tc>
-      </w:tr>
-      <w:tr>
-        <w:tc>
-          <w:tcPr>
-            <w:tcW w:type="dxa" w:w="567"/>
-          </w:tcPr>
-          <w:p>
-            <w:r>
-              <w:t>2</w:t>
-            </w:r>
-          </w:p>
-        </w:tc>
-        <w:tc>
-          <w:tcPr>
-            <w:tcW w:type="dxa" w:w="7937"/>
-          </w:tcPr>
-          <w:p>
-            <w:r>
-              <w:t>Новогодние каникулы под парусом. 1,5 часа в море</w:t>
-            </w:r>
-          </w:p>
-        </w:tc>
-        <w:tc>
-          <w:tcPr>
-            <w:tcW w:type="dxa" w:w="1417"/>
-          </w:tcPr>
-          <w:p>
-            <w:r>
-              <w:t>48</w:t>
-            </w:r>
-          </w:p>
-        </w:tc>
-      </w:tr>
-      <w:tr>
-        <w:tc>
-          <w:tcPr>
-            <w:tcW w:type="dxa" w:w="567"/>
-          </w:tcPr>
-          <w:p>
-            <w:r>
-              <w:t>3</w:t>
-            </w:r>
-          </w:p>
-        </w:tc>
-        <w:tc>
-          <w:tcPr>
-            <w:tcW w:type="dxa" w:w="7937"/>
-          </w:tcPr>
-          <w:p>
-            <w:r>
-              <w:t>Парусная яхта: выходы каждые полтора часа</w:t>
-            </w:r>
-          </w:p>
-        </w:tc>
-        <w:tc>
-          <w:tcPr>
-            <w:tcW w:type="dxa" w:w="1417"/>
-          </w:tcPr>
-          <w:p>
-            <w:r>
-              <w:t>41</w:t>
-            </w:r>
-          </w:p>
-        </w:tc>
-      </w:tr>
-      <w:tr>
-        <w:tc>
-          <w:tcPr>
-            <w:tcW w:type="dxa" w:w="567"/>
-          </w:tcPr>
-          <w:p>
-            <w:r>
-              <w:t>4</w:t>
-            </w:r>
-          </w:p>
-        </w:tc>
-        <w:tc>
-          <w:tcPr>
-            <w:tcW w:type="dxa" w:w="7937"/>
-          </w:tcPr>
-          <w:p>
-            <w:r>
-              <w:t>Под парусом зимой: море и снежные горы</w:t>
-            </w:r>
-          </w:p>
-        </w:tc>
-        <w:tc>
-          <w:tcPr>
-            <w:tcW w:type="dxa" w:w="1417"/>
-          </w:tcPr>
-          <w:p>
-            <w:r>
-              <w:t>38</w:t>
-            </w:r>
-          </w:p>
-        </w:tc>
-      </w:tr>
-      <w:tr>
-        <w:tc>
-          <w:tcPr>
-            <w:tcW w:type="dxa" w:w="567"/>
-          </w:tcPr>
-          <w:p>
-            <w:r>
-              <w:t>5</w:t>
-            </w:r>
-          </w:p>
-        </w:tc>
-        <w:tc>
-          <w:tcPr>
-            <w:tcW w:type="dxa" w:w="7937"/>
-          </w:tcPr>
-          <w:p>
-            <w:r>
-              <w:t>Морская прогулка в группе — 1 800 ₽ с человека</w:t>
-            </w:r>
-          </w:p>
-        </w:tc>
-        <w:tc>
-          <w:tcPr>
-            <w:tcW w:type="dxa" w:w="1417"/>
-          </w:tcPr>
-          <w:p>
-            <w:r>
-              <w:t>46</w:t>
-            </w:r>
-          </w:p>
-        </w:tc>
-      </w:tr>
-    </w:tbl>
-    <w:p/>
-    <w:p>
-      <w:r>
-        <w:rPr>
-          <w:b/>
-          <w:i w:val="0"/>
-        </w:rPr>
-        <w:t>Тексты (до 81 символа, можно до 3):</w:t>
-      </w:r>
-    </w:p>
-    <w:tbl>
-      <w:tblPr>
-        <w:tblStyle w:val="TableGrid"/>
-        <w:tblW w:type="auto" w:w="0"/>
-        <w:tblLook w:firstColumn="1" w:firstRow="1" w:lastColumn="0" w:lastRow="0" w:noHBand="0" w:noVBand="1" w:val="04A0"/>
-      </w:tblPr>
-      <w:tblGrid>
-        <w:gridCol w:w="3400"/>
-        <w:gridCol w:w="3400"/>
-        <w:gridCol w:w="3400"/>
-      </w:tblGrid>
-      <w:tr>
-        <w:tc>
-          <w:tcPr>
-            <w:tcW w:type="dxa" w:w="567"/>
-            <w:shd w:val="clear" w:color="auto" w:fill="DCE6F1"/>
-          </w:tcPr>
-          <w:p>
-            <w:r/>
-            <w:r>
-              <w:rPr>
-                <w:b/>
-              </w:rPr>
-              <w:t>№</w:t>
-            </w:r>
-          </w:p>
-        </w:tc>
-        <w:tc>
-          <w:tcPr>
-            <w:tcW w:type="dxa" w:w="7937"/>
-            <w:shd w:val="clear" w:color="auto" w:fill="DCE6F1"/>
-          </w:tcPr>
-          <w:p>
-            <w:r/>
-            <w:r>
-              <w:rPr>
-                <w:b/>
-              </w:rPr>
-              <w:t>Текст</w:t>
-            </w:r>
-          </w:p>
-        </w:tc>
-        <w:tc>
-          <w:tcPr>
-            <w:tcW w:type="dxa" w:w="1417"/>
-            <w:shd w:val="clear" w:color="auto" w:fill="DCE6F1"/>
-          </w:tcPr>
-          <w:p>
-            <w:r/>
-            <w:r>
-              <w:rPr>
-                <w:b/>
-              </w:rPr>
-              <w:t>Символов</w:t>
-            </w:r>
-          </w:p>
-        </w:tc>
-      </w:tr>
-      <w:tr>
-        <w:tc>
-          <w:tcPr>
-            <w:tcW w:type="dxa" w:w="567"/>
-          </w:tcPr>
-          <w:p>
-            <w:r>
-              <w:t>1</w:t>
-            </w:r>
-          </w:p>
-        </w:tc>
-        <w:tc>
-          <w:tcPr>
-            <w:tcW w:type="dxa" w:w="7937"/>
-          </w:tcPr>
-          <w:p>
-            <w:r>
-              <w:t>1,5 часа под парусом, 1 800 ₽ с человека. Выходы с 9:00 до 17:00.</w:t>
-            </w:r>
-          </w:p>
-        </w:tc>
-        <w:tc>
-          <w:tcPr>
-            <w:tcW w:type="dxa" w:w="1417"/>
-          </w:tcPr>
-          <w:p>
-            <w:r>
-              <w:t>65</w:t>
-            </w:r>
-          </w:p>
-        </w:tc>
-      </w:tr>
-      <w:tr>
-        <w:tc>
-          <w:tcPr>
-            <w:tcW w:type="dxa" w:w="567"/>
-          </w:tcPr>
-          <w:p>
-            <w:r>
-              <w:t>2</w:t>
-            </w:r>
-          </w:p>
-        </w:tc>
-        <w:tc>
-          <w:tcPr>
-            <w:tcW w:type="dxa" w:w="7937"/>
-          </w:tcPr>
-          <w:p>
-            <w:r>
-              <w:t>Бронь мест без предоплаты. Выход подтверждаем в день прогулки по погоде.</w:t>
-            </w:r>
-          </w:p>
-        </w:tc>
-        <w:tc>
-          <w:tcPr>
-            <w:tcW w:type="dxa" w:w="1417"/>
-          </w:tcPr>
-          <w:p>
-            <w:r>
-              <w:t>72</w:t>
-            </w:r>
-          </w:p>
-        </w:tc>
-      </w:tr>
-      <w:tr>
-        <w:tc>
-          <w:tcPr>
-            <w:tcW w:type="dxa" w:w="567"/>
-          </w:tcPr>
-          <w:p>
-            <w:r>
-              <w:t>3</w:t>
-            </w:r>
-          </w:p>
-        </w:tc>
-        <w:tc>
-          <w:tcPr>
-            <w:tcW w:type="dxa" w:w="7937"/>
-          </w:tcPr>
-          <w:p>
-            <w:r>
-              <w:t>До 11 пассажиров, включая детей. Имеретинский порт, Сириус.</w:t>
-            </w:r>
-          </w:p>
-        </w:tc>
-        <w:tc>
-          <w:tcPr>
-            <w:tcW w:type="dxa" w:w="1417"/>
-          </w:tcPr>
-          <w:p>
-            <w:r>
-              <w:t>59</w:t>
-            </w:r>
-          </w:p>
-        </w:tc>
-      </w:tr>
-    </w:tbl>
-    <w:p/>
-    <w:p>
-      <w:r>
-        <w:rPr>
-          <w:b w:val="0"/>
-          <w:i w:val="0"/>
-        </w:rPr>
-        <w:t>Ссылка: https://boat-sochi.ru/yachts_ny?utm_source=yandex&amp;utm_medium=cpc&amp;utm_campaign=epk_yachts_ny&amp;utm_content=G3_{ad_id}&amp;utm_term={keyword}&amp;site={source}</w:t>
-      </w:r>
-    </w:p>
-    <w:p>
-      <w:r>
-        <w:rPr>
-          <w:b w:val="0"/>
-          <w:i w:val="0"/>
-        </w:rPr>
-        <w:t>Цена в объявлении: 1 800 ₽. Кнопка: «Забронировать».</w:t>
-      </w:r>
-    </w:p>
-    <w:p>
-      <w:r>
-        <w:rPr>
-          <w:b w:val="0"/>
-          <w:i w:val="0"/>
-        </w:rPr>
-        <w:t>Изображения: «Новогодние каникулы под парусом · 1,5 часа · 1800 ₽» (4:3), квадрат парусника «Новогодние каникулы 2027» (1:1).</w:t>
-      </w:r>
-    </w:p>
-    <w:p>
-      <w:pPr>
-        <w:pStyle w:val="Heading1"/>
-      </w:pPr>
-      <w:r>
-        <w:t>6. Расширения (одинаковые для всех групп)</w:t>
-      </w:r>
-    </w:p>
-    <w:p>
-      <w:pPr>
-        <w:pStyle w:val="Heading2"/>
-      </w:pPr>
-      <w:r>
-        <w:t>6.1. Быстрые ссылки — 8 штук (заголовок до 30, описание до 60)</w:t>
+        <w:t>3.1. Быстрые ссылки — 8 штук (заголовок до 30, описание до 60)</w:t>
       </w:r>
     </w:p>
     <w:tbl>
@@ -4854,7 +3468,7 @@
           <w:b w:val="0"/>
           <w:i/>
         </w:rPr>
-        <w:t>Параметр ?sl=N делает адреса быстрых ссылок разными. В G3 первыми поставить «Под парусом — 1 800 ₽» и «Бронь без предоплаты».</w:t>
+        <w:t>Параметр ?sl=N делает адреса быстрых ссылок разными.</w:t>
       </w:r>
     </w:p>
     <w:p>
@@ -4862,7 +3476,7 @@
         <w:pStyle w:val="Heading2"/>
       </w:pPr>
       <w:r>
-        <w:t>6.2. Уточнения (до 25 символов каждое, всего до 132)</w:t>
+        <w:t>3.2. Уточнения (до 25 символов каждое, всего до 132)</w:t>
       </w:r>
     </w:p>
     <w:tbl>
@@ -5184,7 +3798,7 @@
         <w:pStyle w:val="Heading2"/>
       </w:pPr>
       <w:r>
-        <w:t>6.3. Изображения и видео</w:t>
+        <w:t>3.3. Изображения и видео</w:t>
       </w:r>
     </w:p>
     <w:p>
@@ -5232,7 +3846,7 @@
         <w:pStyle w:val="Heading2"/>
       </w:pPr>
       <w:r>
-        <w:t>6.4. Оценка присланных креативов</w:t>
+        <w:t>3.4. Оценка присланных креативов</w:t>
       </w:r>
     </w:p>
     <w:tbl>
@@ -5326,7 +3940,7 @@
           </w:tcPr>
           <w:p>
             <w:r>
-              <w:t>G1, G2</w:t>
+              <w:t>G1</w:t>
             </w:r>
           </w:p>
         </w:tc>
@@ -5368,7 +3982,7 @@
           </w:tcPr>
           <w:p>
             <w:r>
-              <w:t>G1, G2</w:t>
+              <w:t>G1</w:t>
             </w:r>
           </w:p>
         </w:tc>
@@ -5452,7 +4066,7 @@
           </w:tcPr>
           <w:p>
             <w:r>
-              <w:t>G3, G2</w:t>
+              <w:t>— (группа «Парусник», позже)</w:t>
             </w:r>
           </w:p>
         </w:tc>
@@ -5494,7 +4108,7 @@
           </w:tcPr>
           <w:p>
             <w:r>
-              <w:t>G3</w:t>
+              <w:t>— (группа «Парусник», позже)</w:t>
             </w:r>
           </w:p>
         </w:tc>
@@ -5568,7 +4182,7 @@
         <w:pStyle w:val="Heading1"/>
       </w:pPr>
       <w:r>
-        <w:t>7. План по датам</w:t>
+        <w:t>4. План по датам</w:t>
       </w:r>
     </w:p>
     <w:tbl>
@@ -5630,7 +4244,7 @@
           </w:tcPr>
           <w:p>
             <w:r>
-              <w:t>Запуск G1, G2, G3. Бюджет 7 000 ₽/нед. Не трогать 7 дней.</w:t>
+              <w:t>Запуск G1. Бюджет 7 000 ₽/нед. Не трогать 7 дней.</w:t>
             </w:r>
           </w:p>
         </w:tc>
@@ -5674,7 +4288,7 @@
           </w:tcPr>
           <w:p>
             <w:r>
-              <w:t>Горячая фаза, бюджет 12 000 ₽/нед. С 26.12 G2 и G3 главные — люди уже на месте. Корректировка Сочи/Сириус +30%.</w:t>
+              <w:t>Горячая фаза, бюджет 12 000 ₽/нед. Ориентировочно в это время добавить группы «Гости Сириуса и Имеретинки» и «Прогулка под парусом 1 800 ₽» — настройки готовим отдельно. Корректировка Сочи/Сириус +30%.</w:t>
             </w:r>
           </w:p>
         </w:tc>
@@ -5708,7 +4322,7 @@
         <w:pStyle w:val="Heading1"/>
       </w:pPr>
       <w:r>
-        <w:t>8. Перед запуском — чек-лист</w:t>
+        <w:t>5. Перед запуском — чек-лист</w:t>
       </w:r>
     </w:p>
     <w:p>
@@ -5740,14 +4354,6 @@
         <w:pStyle w:val="ListBullet"/>
       </w:pPr>
       <w:r>
-        <w:t>Приостановить парусник на 1–10 января в ЕПК «Групповые прогулки» 713449981 (или убрать оттуда новогодние тексты) — его продаёт G3.</w:t>
-      </w:r>
-    </w:p>
-    <w:p>
-      <w:pPr>
-        <w:pStyle w:val="ListBullet"/>
-      </w:pPr>
-      <w:r>
         <w:t>Согласовать с лыжной ЕПК: разные utm_campaign, в ней — своя посадочная; лыжные сигналы здесь уже заминусованы.</w:t>
       </w:r>
     </w:p>
@@ -5772,7 +4378,7 @@
         <w:pStyle w:val="Heading1"/>
       </w:pPr>
       <w:r>
-        <w:t>9. Что не писать в объявлениях</w:t>
+        <w:t>6. Что не писать в объявлениях</w:t>
       </w:r>
     </w:p>
     <w:p>

</xml_diff>

<commit_message>
EPK /yachts_ny: sync with cabinet settings (org profile, budget, sitelinks, callouts, stop-list); defer ski minus-phrases
Co-authored-by: Igor-Lark <Igor-Lark@users.noreply.github.com>
</commit_message>
<xml_diff>
--- a/reklama/EPK_yachts_ny_NG2027_zima.docx
+++ b/reklama/EPK_yachts_ny_NG2027_zima.docx
@@ -65,7 +65,7 @@
         <w:pStyle w:val="ListBullet"/>
       </w:pPr>
       <w:r>
-        <w:t>Лыжники и сноубордисты Красной Поляны — НЕ в этой кампании: под них отдельная ЕПК с отдельной посадочной. Здесь их отсекаем минус-фразами (раздел 1.3), чтобы кампании не конкурировали.</w:t>
+        <w:t>Лыжники и сноубордисты Красной Поляны — НЕ в этой кампании: под них отдельная ЕПК с отдельной посадочной. Лыжные минус-фразы (раздел 1.3) ставим в момент запуска лыжной ЕПК, не раньше.</w:t>
       </w:r>
     </w:p>
     <w:p>
@@ -425,7 +425,7 @@
           </w:tcPr>
           <w:p>
             <w:r>
-              <w:t>01.11–14.12: 7 000 ₽/нед · 15.12–10.01: 12 000 ₽/нед · 11.01–28.02: 7 000 ₽/нед</w:t>
+              <w:t>01.11–14.12: 10 000 ₽/нед · 15.12–10.01: 12 000 ₽/нед · 11.01–28.02: 7 000 ₽/нед</w:t>
             </w:r>
           </w:p>
         </w:tc>
@@ -457,7 +457,7 @@
           </w:tcPr>
           <w:p>
             <w:r>
-              <w:t>94713538 (сайт) · 103116887 (профиль организации — только если подключаете организацию)</w:t>
+              <w:t>94713538 (сайт) · 103116887 (профиль организации)</w:t>
             </w:r>
           </w:p>
         </w:tc>
@@ -609,7 +609,7 @@
           </w:tcPr>
           <w:p>
             <w:r>
-              <w:t>Не подключать на старте</w:t>
+              <w:t>«Яхты Сириуса», Сириус, Голубая улица, 1 — подключить</w:t>
             </w:r>
           </w:p>
         </w:tc>
@@ -619,7 +619,7 @@
           </w:tcPr>
           <w:p>
             <w:r>
-              <w:t>Профиль «Яхты Сириуса» — Морской бульвар 1В/3 и телефон Натальи; на /yachts_ny адрес ул. Голубая 1, линия 1 и телефон Олега. Расхождение запутает клиента</w:t>
+              <w:t>Адрес и телефон профиля совпадают с /yachts_ny. Телефон в объявлении берётся из профиля</w:t>
             </w:r>
           </w:p>
         </w:tc>
@@ -1493,7 +1493,7 @@
           <w:b/>
           <w:i w:val="0"/>
         </w:rPr>
-        <w:t>Отсечка лыжной аудитории (её ведёт отдельная ЕПК):</w:t>
+        <w:t>Отсечка лыжной аудитории — НЕ ставить сейчас. Добавить в день запуска лыжной ЕПК:</w:t>
       </w:r>
     </w:p>
     <w:p>
@@ -1552,7 +1552,7 @@
           <w:b w:val="0"/>
           <w:i w:val="0"/>
         </w:rPr>
-        <w:t>Стоп-лист кампании «Сириус» — переносим целиком. Новые площадки добавлять только по выгрузке «Площадки» за 7+ дней: 100+ показов и 0 кликов или клики без целей.</w:t>
+        <w:t>Основа — список из кабинета (≈130 площадок): мобильные игры и головоломки, системные приложения Xiaomi, внешние SSP dsp-*.yandex.ru, game.yandex.ru. Оставить как есть. Добавить к нему площадки, которые не дали целей в кампании «Сириус»:</w:t>
       </w:r>
     </w:p>
     <w:p>
@@ -1561,20 +1561,6 @@
           <w:rFonts w:ascii="Consolas" w:hAnsi="Consolas"/>
           <w:sz w:val="19"/>
         </w:rPr>
-        <w:t>m.pogoda.yandex.ru</w:t>
-        <w:br/>
-        <w:t>pogoda.yandex.ru</w:t>
-        <w:br/>
-        <w:t>gismeteo.ru</w:t>
-        <w:br/>
-        <w:t>traffic.ru</w:t>
-        <w:br/>
-        <w:t>nashaspravka.ru</w:t>
-        <w:br/>
-        <w:t>zoon.ru</w:t>
-        <w:br/>
-        <w:t>tiletrip.ru</w:t>
-        <w:br/>
         <w:t>imo.im</w:t>
         <w:br/>
         <w:t>com.outfit7.talkingtom</w:t>
@@ -1589,13 +1575,22 @@
         <w:br/>
         <w:t>orgs.biz</w:t>
         <w:br/>
-        <w:t>e1.ru</w:t>
+        <w:t>nashaspravka.ru</w:t>
         <w:br/>
-        <w:t>rbc.ru</w:t>
+        <w:t>zoon.ru</w:t>
         <w:br/>
-        <w:t>kp.ru</w:t>
+        <w:t>traffic.ru</w:t>
         <w:br/>
-        <w:t>aif.ru</w:t>
+        <w:t>tiletrip.ru</w:t>
+      </w:r>
+    </w:p>
+    <w:p>
+      <w:r>
+        <w:rPr>
+          <w:b w:val="0"/>
+          <w:i w:val="0"/>
+        </w:rPr>
+        <w:t>Погоду (pogoda.yandex.ru, gismeteo.ru) и новостные сайты (rbc.ru, kp.ru, aif.ru, e1.ru) на старте НЕ блокировать: в «Сириусе» была местная аудитория, а G1 — туристы по всей России, и смотреть погоду в Сочи перед поездкой — как раз их поведение. Решать по отчёту {source} через 7 дней. Новые площадки добавлять по выгрузке «Площадки» за 7+ дней: 100+ показов и 0 кликов или клики без целей.</w:t>
       </w:r>
     </w:p>
     <w:p>
@@ -2704,7 +2699,7 @@
           </w:tcPr>
           <w:p>
             <w:r>
-              <w:t>Катер «Сириус» — 8 000 ₽/час</w:t>
+              <w:t>Морская прогулка под парусом</w:t>
             </w:r>
           </w:p>
         </w:tc>
@@ -2724,7 +2719,7 @@
           </w:tcPr>
           <w:p>
             <w:r>
-              <w:t>Bayliner 285, до 7 гостей. Цена за весь катер</w:t>
+              <w:t>1 800 ₽ с человека, 1,5 часа в море, выходы с 9:00 до 17:00</w:t>
             </w:r>
           </w:p>
         </w:tc>
@@ -2734,7 +2729,7 @@
           </w:tcPr>
           <w:p>
             <w:r>
-              <w:t>45</w:t>
+              <w:t>59</w:t>
             </w:r>
           </w:p>
         </w:tc>
@@ -2766,7 +2761,7 @@
           </w:tcPr>
           <w:p>
             <w:r>
-              <w:t>Яхта «Бруно» — 14 500 ₽/час</w:t>
+              <w:t>Прогулка с детьми</w:t>
             </w:r>
           </w:p>
         </w:tc>
@@ -2776,7 +2771,7 @@
           </w:tcPr>
           <w:p>
             <w:r>
-              <w:t>27</w:t>
+              <w:t>17</w:t>
             </w:r>
           </w:p>
         </w:tc>
@@ -2786,7 +2781,7 @@
           </w:tcPr>
           <w:p>
             <w:r>
-              <w:t>Abbate G41, до 11 гостей, 2 каюты</w:t>
+              <w:t>Яркое впечатление каникул: дети считаются пассажирами</w:t>
             </w:r>
           </w:p>
         </w:tc>
@@ -2796,7 +2791,7 @@
           </w:tcPr>
           <w:p>
             <w:r>
-              <w:t>33</w:t>
+              <w:t>53</w:t>
             </w:r>
           </w:p>
         </w:tc>
@@ -2828,7 +2823,7 @@
           </w:tcPr>
           <w:p>
             <w:r>
-              <w:t>Под парусом — 1 800 ₽</w:t>
+              <w:t>Бронь без предоплаты</w:t>
             </w:r>
           </w:p>
         </w:tc>
@@ -2838,7 +2833,7 @@
           </w:tcPr>
           <w:p>
             <w:r>
-              <w:t>21</w:t>
+              <w:t>20</w:t>
             </w:r>
           </w:p>
         </w:tc>
@@ -2848,7 +2843,7 @@
           </w:tcPr>
           <w:p>
             <w:r>
-              <w:t>Прогулка 1,5 часа в группе, выходы с 9:00 до 17:00</w:t>
+              <w:t>Бронируйте на дату с 1 по 10 января, сообщим о выходе</w:t>
             </w:r>
           </w:p>
         </w:tc>
@@ -2858,7 +2853,7 @@
           </w:tcPr>
           <w:p>
             <w:r>
-              <w:t>50</w:t>
+              <w:t>53</w:t>
             </w:r>
           </w:p>
         </w:tc>
@@ -2868,7 +2863,7 @@
           </w:tcPr>
           <w:p>
             <w:r>
-              <w:t>https://boat-sochi.ru/yachts_ny?sl=3#yachts</w:t>
+              <w:t>https://boat-sochi.ru/yachts_ny?sl=3#book</w:t>
             </w:r>
           </w:p>
         </w:tc>
@@ -2890,7 +2885,7 @@
           </w:tcPr>
           <w:p>
             <w:r>
-              <w:t>Бронь без предоплаты</w:t>
+              <w:t>Катер «Сириус» — 8000 ₽/час</w:t>
             </w:r>
           </w:p>
         </w:tc>
@@ -2900,7 +2895,7 @@
           </w:tcPr>
           <w:p>
             <w:r>
-              <w:t>20</w:t>
+              <w:t>27</w:t>
             </w:r>
           </w:p>
         </w:tc>
@@ -2910,7 +2905,7 @@
           </w:tcPr>
           <w:p>
             <w:r>
-              <w:t>Оставьте дату 1–10 января — сообщим о выходе</w:t>
+              <w:t>Цена за весь катер, до 7 гостей, Bayliner 285</w:t>
             </w:r>
           </w:p>
         </w:tc>
@@ -2920,7 +2915,7 @@
           </w:tcPr>
           <w:p>
             <w:r>
-              <w:t>44</w:t>
+              <w:t>45</w:t>
             </w:r>
           </w:p>
         </w:tc>
@@ -2930,7 +2925,7 @@
           </w:tcPr>
           <w:p>
             <w:r>
-              <w:t>https://boat-sochi.ru/yachts_ny?sl=4#book</w:t>
+              <w:t>https://boat-sochi.ru/yachts_ny?sl=4#yachts</w:t>
             </w:r>
           </w:p>
         </w:tc>
@@ -2952,7 +2947,7 @@
           </w:tcPr>
           <w:p>
             <w:r>
-              <w:t>Как проходит бронь</w:t>
+              <w:t>Яхта «Бруно» — 14 500 ₽/час</w:t>
             </w:r>
           </w:p>
         </w:tc>
@@ -2962,7 +2957,7 @@
           </w:tcPr>
           <w:p>
             <w:r>
-              <w:t>18</w:t>
+              <w:t>27</w:t>
             </w:r>
           </w:p>
         </w:tc>
@@ -2972,7 +2967,7 @@
           </w:tcPr>
           <w:p>
             <w:r>
-              <w:t>Выбор яхты, заявка, подтверждение по погоде</w:t>
+              <w:t>Цена за всю яхту, до 11 гостей, 2 каюты, Abbate G41</w:t>
             </w:r>
           </w:p>
         </w:tc>
@@ -2982,7 +2977,7 @@
           </w:tcPr>
           <w:p>
             <w:r>
-              <w:t>43</w:t>
+              <w:t>51</w:t>
             </w:r>
           </w:p>
         </w:tc>
@@ -2992,7 +2987,7 @@
           </w:tcPr>
           <w:p>
             <w:r>
-              <w:t>https://boat-sochi.ru/yachts_ny?sl=5#book</w:t>
+              <w:t>https://boat-sochi.ru/yachts_ny?sl=5#yachts</w:t>
             </w:r>
           </w:p>
         </w:tc>
@@ -3014,7 +3009,7 @@
           </w:tcPr>
           <w:p>
             <w:r>
-              <w:t>Где посадка</w:t>
+              <w:t>Имеретинский порт</w:t>
             </w:r>
           </w:p>
         </w:tc>
@@ -3024,7 +3019,7 @@
           </w:tcPr>
           <w:p>
             <w:r>
-              <w:t>11</w:t>
+              <w:t>17</w:t>
             </w:r>
           </w:p>
         </w:tc>
@@ -3034,7 +3029,7 @@
           </w:tcPr>
           <w:p>
             <w:r>
-              <w:t>Сириус, Имеретинский порт, линия 1</w:t>
+              <w:t>Посадка: Сириус, Имеретинский порт, линия 1</w:t>
             </w:r>
           </w:p>
         </w:tc>
@@ -3044,7 +3039,7 @@
           </w:tcPr>
           <w:p>
             <w:r>
-              <w:t>34</w:t>
+              <w:t>43</w:t>
             </w:r>
           </w:p>
         </w:tc>
@@ -3096,7 +3091,7 @@
           </w:tcPr>
           <w:p>
             <w:r>
-              <w:t>Для юрлиц и ИП, закрывающие документы</w:t>
+              <w:t>Для юрлиц и ИП, предоставим закрывающие документы</w:t>
             </w:r>
           </w:p>
         </w:tc>
@@ -3106,7 +3101,7 @@
           </w:tcPr>
           <w:p>
             <w:r>
-              <w:t>37</w:t>
+              <w:t>49</w:t>
             </w:r>
           </w:p>
         </w:tc>
@@ -3138,7 +3133,7 @@
           </w:tcPr>
           <w:p>
             <w:r>
-              <w:t>Связаться с нами</w:t>
+              <w:t>Контакты</w:t>
             </w:r>
           </w:p>
         </w:tc>
@@ -3148,7 +3143,7 @@
           </w:tcPr>
           <w:p>
             <w:r>
-              <w:t>16</w:t>
+              <w:t>8</w:t>
             </w:r>
           </w:p>
         </w:tc>
@@ -3158,7 +3153,7 @@
           </w:tcPr>
           <w:p>
             <w:r>
-              <w:t>+7 917 675-05-55, WhatsApp, Telegram, MAX</w:t>
+              <w:t>+7 917 675-05-55, MAX, Telegram, WhatsApp</w:t>
             </w:r>
           </w:p>
         </w:tc>
@@ -3179,283 +3174,6 @@
           <w:p>
             <w:r>
               <w:t>https://boat-sochi.ru/yachts_ny?sl=8#book</w:t>
-            </w:r>
-          </w:p>
-        </w:tc>
-      </w:tr>
-    </w:tbl>
-    <w:p/>
-    <w:p>
-      <w:r>
-        <w:rPr>
-          <w:b/>
-          <w:i w:val="0"/>
-        </w:rPr>
-        <w:t>Запасные быстрые ссылки (в ЕПК максимум 8 — ставить вместо слабых):</w:t>
-      </w:r>
-    </w:p>
-    <w:tbl>
-      <w:tblPr>
-        <w:tblStyle w:val="TableGrid"/>
-        <w:tblW w:type="auto" w:w="0"/>
-        <w:tblLook w:firstColumn="1" w:firstRow="1" w:lastColumn="0" w:lastRow="0" w:noHBand="0" w:noVBand="1" w:val="04A0"/>
-      </w:tblPr>
-      <w:tblGrid>
-        <w:gridCol w:w="1457"/>
-        <w:gridCol w:w="1457"/>
-        <w:gridCol w:w="1457"/>
-        <w:gridCol w:w="1457"/>
-        <w:gridCol w:w="1457"/>
-        <w:gridCol w:w="1457"/>
-        <w:gridCol w:w="1457"/>
-      </w:tblGrid>
-      <w:tr>
-        <w:tc>
-          <w:tcPr>
-            <w:tcW w:type="dxa" w:w="397"/>
-            <w:shd w:val="clear" w:color="auto" w:fill="DCE6F1"/>
-          </w:tcPr>
-          <w:p>
-            <w:r/>
-            <w:r>
-              <w:rPr>
-                <w:b/>
-              </w:rPr>
-              <w:t>№</w:t>
-            </w:r>
-          </w:p>
-        </w:tc>
-        <w:tc>
-          <w:tcPr>
-            <w:tcW w:type="dxa" w:w="1814"/>
-            <w:shd w:val="clear" w:color="auto" w:fill="DCE6F1"/>
-          </w:tcPr>
-          <w:p>
-            <w:r/>
-            <w:r>
-              <w:rPr>
-                <w:b/>
-              </w:rPr>
-              <w:t>Заголовок</w:t>
-            </w:r>
-          </w:p>
-        </w:tc>
-        <w:tc>
-          <w:tcPr>
-            <w:tcW w:type="dxa" w:w="567"/>
-            <w:shd w:val="clear" w:color="auto" w:fill="DCE6F1"/>
-          </w:tcPr>
-          <w:p>
-            <w:r/>
-            <w:r>
-              <w:rPr>
-                <w:b/>
-              </w:rPr>
-              <w:t>Симв.</w:t>
-            </w:r>
-          </w:p>
-        </w:tc>
-        <w:tc>
-          <w:tcPr>
-            <w:tcW w:type="dxa" w:w="2494"/>
-            <w:shd w:val="clear" w:color="auto" w:fill="DCE6F1"/>
-          </w:tcPr>
-          <w:p>
-            <w:r/>
-            <w:r>
-              <w:rPr>
-                <w:b/>
-              </w:rPr>
-              <w:t>Описание</w:t>
-            </w:r>
-          </w:p>
-        </w:tc>
-        <w:tc>
-          <w:tcPr>
-            <w:tcW w:type="dxa" w:w="567"/>
-            <w:shd w:val="clear" w:color="auto" w:fill="DCE6F1"/>
-          </w:tcPr>
-          <w:p>
-            <w:r/>
-            <w:r>
-              <w:rPr>
-                <w:b/>
-              </w:rPr>
-              <w:t>Симв.</w:t>
-            </w:r>
-          </w:p>
-        </w:tc>
-        <w:tc>
-          <w:tcPr>
-            <w:tcW w:type="dxa" w:w="2154"/>
-            <w:shd w:val="clear" w:color="auto" w:fill="DCE6F1"/>
-          </w:tcPr>
-          <w:p>
-            <w:r/>
-            <w:r>
-              <w:rPr>
-                <w:b/>
-              </w:rPr>
-              <w:t>Ссылка (+UTM кампании)</w:t>
-            </w:r>
-          </w:p>
-        </w:tc>
-        <w:tc>
-          <w:tcPr>
-            <w:tcW w:type="dxa" w:w="1928"/>
-            <w:shd w:val="clear" w:color="auto" w:fill="DCE6F1"/>
-          </w:tcPr>
-          <w:p>
-            <w:r/>
-            <w:r>
-              <w:rPr>
-                <w:b/>
-              </w:rPr>
-              <w:t>Куда ставить</w:t>
-            </w:r>
-          </w:p>
-        </w:tc>
-      </w:tr>
-      <w:tr>
-        <w:tc>
-          <w:tcPr>
-            <w:tcW w:type="dxa" w:w="397"/>
-          </w:tcPr>
-          <w:p>
-            <w:r>
-              <w:t>9</w:t>
-            </w:r>
-          </w:p>
-        </w:tc>
-        <w:tc>
-          <w:tcPr>
-            <w:tcW w:type="dxa" w:w="1814"/>
-          </w:tcPr>
-          <w:p>
-            <w:r>
-              <w:t>Без праздничной наценки</w:t>
-            </w:r>
-          </w:p>
-        </w:tc>
-        <w:tc>
-          <w:tcPr>
-            <w:tcW w:type="dxa" w:w="567"/>
-          </w:tcPr>
-          <w:p>
-            <w:r>
-              <w:t>23</w:t>
-            </w:r>
-          </w:p>
-        </w:tc>
-        <w:tc>
-          <w:tcPr>
-            <w:tcW w:type="dxa" w:w="2494"/>
-          </w:tcPr>
-          <w:p>
-            <w:r>
-              <w:t>Цена за всё судно в январе — как в обычные дни</w:t>
-            </w:r>
-          </w:p>
-        </w:tc>
-        <w:tc>
-          <w:tcPr>
-            <w:tcW w:type="dxa" w:w="567"/>
-          </w:tcPr>
-          <w:p>
-            <w:r>
-              <w:t>46</w:t>
-            </w:r>
-          </w:p>
-        </w:tc>
-        <w:tc>
-          <w:tcPr>
-            <w:tcW w:type="dxa" w:w="2154"/>
-          </w:tcPr>
-          <w:p>
-            <w:r>
-              <w:t>https://boat-sochi.ru/yachts_ny?sl=9#yachts</w:t>
-            </w:r>
-          </w:p>
-        </w:tc>
-        <w:tc>
-          <w:tcPr>
-            <w:tcW w:type="dxa" w:w="1928"/>
-          </w:tcPr>
-          <w:p>
-            <w:r>
-              <w:t>вместо №5 «Как проходит бронь» — дублирует №4</w:t>
-            </w:r>
-          </w:p>
-        </w:tc>
-      </w:tr>
-      <w:tr>
-        <w:tc>
-          <w:tcPr>
-            <w:tcW w:type="dxa" w:w="397"/>
-          </w:tcPr>
-          <w:p>
-            <w:r>
-              <w:t>10</w:t>
-            </w:r>
-          </w:p>
-        </w:tc>
-        <w:tc>
-          <w:tcPr>
-            <w:tcW w:type="dxa" w:w="1814"/>
-          </w:tcPr>
-          <w:p>
-            <w:r>
-              <w:t>Прогулка с детьми</w:t>
-            </w:r>
-          </w:p>
-        </w:tc>
-        <w:tc>
-          <w:tcPr>
-            <w:tcW w:type="dxa" w:w="567"/>
-          </w:tcPr>
-          <w:p>
-            <w:r>
-              <w:t>17</w:t>
-            </w:r>
-          </w:p>
-        </w:tc>
-        <w:tc>
-          <w:tcPr>
-            <w:tcW w:type="dxa" w:w="2494"/>
-          </w:tcPr>
-          <w:p>
-            <w:r>
-              <w:t>Дети считаются в число гостей: катер до 7, яхта до 11</w:t>
-            </w:r>
-          </w:p>
-        </w:tc>
-        <w:tc>
-          <w:tcPr>
-            <w:tcW w:type="dxa" w:w="567"/>
-          </w:tcPr>
-          <w:p>
-            <w:r>
-              <w:t>53</w:t>
-            </w:r>
-          </w:p>
-        </w:tc>
-        <w:tc>
-          <w:tcPr>
-            <w:tcW w:type="dxa" w:w="2154"/>
-          </w:tcPr>
-          <w:p>
-            <w:r>
-              <w:t>https://boat-sochi.ru/yachts_ny?sl=10#yachts</w:t>
-            </w:r>
-          </w:p>
-        </w:tc>
-        <w:tc>
-          <w:tcPr>
-            <w:tcW w:type="dxa" w:w="1928"/>
-          </w:tcPr>
-          <w:p>
-            <w:r>
-              <w:t>вместо №7 «Оплата по счёту» — на каникулах едут семьи, а не юрлица</w:t>
             </w:r>
           </w:p>
         </w:tc>
@@ -3586,7 +3304,7 @@
           </w:tcPr>
           <w:p>
             <w:r>
-              <w:t>1–10 января</w:t>
+              <w:t>1–10 января 2027</w:t>
             </w:r>
           </w:p>
         </w:tc>
@@ -3596,7 +3314,7 @@
           </w:tcPr>
           <w:p>
             <w:r>
-              <w:t>11</w:t>
+              <w:t>16</w:t>
             </w:r>
           </w:p>
         </w:tc>
@@ -3618,7 +3336,7 @@
           </w:tcPr>
           <w:p>
             <w:r>
-              <w:t>Капитан на борту</w:t>
+              <w:t>Без праздничной наценки</w:t>
             </w:r>
           </w:p>
         </w:tc>
@@ -3628,7 +3346,7 @@
           </w:tcPr>
           <w:p>
             <w:r>
-              <w:t>16</w:t>
+              <w:t>23</w:t>
             </w:r>
           </w:p>
         </w:tc>
@@ -3650,7 +3368,7 @@
           </w:tcPr>
           <w:p>
             <w:r>
-              <w:t>Цена за всё судно</w:t>
+              <w:t>Имеретинский порт</w:t>
             </w:r>
           </w:p>
         </w:tc>
@@ -3682,7 +3400,7 @@
           </w:tcPr>
           <w:p>
             <w:r>
-              <w:t>Без праздничной наценки</w:t>
+              <w:t>Панорама Сириуса и гор</w:t>
             </w:r>
           </w:p>
         </w:tc>
@@ -3692,71 +3410,7 @@
           </w:tcPr>
           <w:p>
             <w:r>
-              <w:t>23</w:t>
-            </w:r>
-          </w:p>
-        </w:tc>
-      </w:tr>
-      <w:tr>
-        <w:tc>
-          <w:tcPr>
-            <w:tcW w:type="dxa" w:w="567"/>
-          </w:tcPr>
-          <w:p>
-            <w:r>
-              <w:t>6</w:t>
-            </w:r>
-          </w:p>
-        </w:tc>
-        <w:tc>
-          <w:tcPr>
-            <w:tcW w:type="dxa" w:w="5669"/>
-          </w:tcPr>
-          <w:p>
-            <w:r>
-              <w:t>Имеретинский порт</w:t>
-            </w:r>
-          </w:p>
-        </w:tc>
-        <w:tc>
-          <w:tcPr>
-            <w:tcW w:type="dxa" w:w="1701"/>
-          </w:tcPr>
-          <w:p>
-            <w:r>
-              <w:t>17</w:t>
-            </w:r>
-          </w:p>
-        </w:tc>
-      </w:tr>
-      <w:tr>
-        <w:tc>
-          <w:tcPr>
-            <w:tcW w:type="dxa" w:w="567"/>
-          </w:tcPr>
-          <w:p>
-            <w:r>
-              <w:t>7</w:t>
-            </w:r>
-          </w:p>
-        </w:tc>
-        <w:tc>
-          <w:tcPr>
-            <w:tcW w:type="dxa" w:w="5669"/>
-          </w:tcPr>
-          <w:p>
-            <w:r>
-              <w:t>Вид на снежные горы</w:t>
-            </w:r>
-          </w:p>
-        </w:tc>
-        <w:tc>
-          <w:tcPr>
-            <w:tcW w:type="dxa" w:w="1701"/>
-          </w:tcPr>
-          <w:p>
-            <w:r>
-              <w:t>19</w:t>
+              <w:t>22</w:t>
             </w:r>
           </w:p>
         </w:tc>
@@ -3786,7 +3440,7 @@
           </w:tcPr>
           <w:p>
             <w:r>
-              <w:t>123</w:t>
+              <w:t>98</w:t>
             </w:r>
           </w:p>
         </w:tc>
@@ -4244,7 +3898,7 @@
           </w:tcPr>
           <w:p>
             <w:r>
-              <w:t>Запуск G1. Бюджет 7 000 ₽/нед. Не трогать 7 дней.</w:t>
+              <w:t>Запуск G1. Бюджет 10 000 ₽/нед. Не трогать 7 дней.</w:t>
             </w:r>
           </w:p>
         </w:tc>
@@ -4354,7 +4008,7 @@
         <w:pStyle w:val="ListBullet"/>
       </w:pPr>
       <w:r>
-        <w:t>Согласовать с лыжной ЕПК: разные utm_campaign, в ней — своя посадочная; лыжные сигналы здесь уже заминусованы.</w:t>
+        <w:t>При запуске лыжной ЕПК: добавить сюда лыжные минус-фразы (раздел 1.3), разные utm_campaign, в лыжной — своя посадочная.</w:t>
       </w:r>
     </w:p>
     <w:p>

</xml_diff>

<commit_message>
EPK /yachts_ny: search on (org lists off), goal prices from cabinet
Co-authored-by: Igor-Lark <Igor-Lark@users.noreply.github.com>
</commit_message>
<xml_diff>
--- a/reklama/EPK_yachts_ny_NG2027_zima.docx
+++ b/reklama/EPK_yachts_ny_NG2027_zima.docx
@@ -41,7 +41,7 @@
         <w:pStyle w:val="ListBullet"/>
       </w:pPr>
       <w:r>
-        <w:t>Тип: Единая перфоманс-кампания (ЕПК), места показа — только РСЯ (+ по желанию Яндекс Карты). Поиск выключен: спрос на Поиске по Сириусу уже собирает кампания «Сириус» 704503370, чтобы не конкурировать с ней в аукционе.</w:t>
+        <w:t>Тип: Единая перфоманс-кампания (ЕПК), места показа — Поиск + РСЯ (Поиск включён сознательно). На Поиске кампания пересекается с «Сириус» 704503370 по запросам про аренду яхт в Сириусе — следить за ценой клика в обеих.</w:t>
       </w:r>
     </w:p>
     <w:p>
@@ -361,7 +361,7 @@
           </w:tcPr>
           <w:p>
             <w:r>
-              <w:t>Поиск: ВЫКЛ все места. Другие площадки: РСЯ ВКЛ; Яндекс Карты — ВКЛ по желанию. «Список организаций, отели и галерея услуг» — ВЫКЛ</w:t>
+              <w:t>Поиск ВКЛ, РСЯ ВКЛ. В расширенных настройках мест показа «Список организаций, отели и галерея услуг» — ВЫКЛ</w:t>
             </w:r>
           </w:p>
         </w:tc>
@@ -808,7 +808,7 @@
           </w:tcPr>
           <w:p>
             <w:r>
-              <w:t>180</w:t>
+              <w:t>120</w:t>
             </w:r>
           </w:p>
         </w:tc>
@@ -850,7 +850,7 @@
           </w:tcPr>
           <w:p>
             <w:r>
-              <w:t>170</w:t>
+              <w:t>140</w:t>
             </w:r>
           </w:p>
         </w:tc>
@@ -890,7 +890,7 @@
           </w:tcPr>
           <w:p>
             <w:r>
-              <w:t>175</w:t>
+              <w:t>100</w:t>
             </w:r>
           </w:p>
         </w:tc>
@@ -930,7 +930,7 @@
           </w:tcPr>
           <w:p>
             <w:r>
-              <w:t>150</w:t>
+              <w:t>110</w:t>
             </w:r>
           </w:p>
         </w:tc>

</xml_diff>

<commit_message>
EPK /yachts_ny: 5 sites moved to watch list
Co-authored-by: Igor-Lark <Igor-Lark@users.noreply.github.com>
</commit_message>
<xml_diff>
--- a/reklama/EPK_yachts_ny_NG2027_zima.docx
+++ b/reklama/EPK_yachts_ny_NG2027_zima.docx
@@ -1572,7 +1572,23 @@
         <w:t>ru.flysoft.idaprikol</w:t>
         <w:br/>
         <w:t>mamba.ru</w:t>
-        <w:br/>
+      </w:r>
+    </w:p>
+    <w:p>
+      <w:r>
+        <w:rPr>
+          <w:b/>
+          <w:i w:val="0"/>
+        </w:rPr>
+        <w:t>Кандидаты на блокировку по статистике (на старте не блокируем, смотрим отчёт по площадкам через 7 дней):</w:t>
+      </w:r>
+    </w:p>
+    <w:p>
+      <w:r>
+        <w:rPr>
+          <w:rFonts w:ascii="Consolas" w:hAnsi="Consolas"/>
+          <w:sz w:val="19"/>
+        </w:rPr>
         <w:t>orgs.biz</w:t>
         <w:br/>
         <w:t>nashaspravka.ru</w:t>

</xml_diff>

<commit_message>
EPK /yachts_ny: G1 final keyword list (35) and group settings from cabinet
Co-authored-by: Igor-Lark <Igor-Lark@users.noreply.github.com>
</commit_message>
<xml_diff>
--- a/reklama/EPK_yachts_ny_NG2027_zima.docx
+++ b/reklama/EPK_yachts_ny_NG2027_zima.docx
@@ -2009,7 +2009,51 @@
           </w:tcPr>
           <w:p>
             <w:r>
-              <w:t>Целевые + узкие</w:t>
+              <w:t>Целевые + узкие ВКЛ; широкие, сопутствующие, альтернативные ВЫКЛ. Свой бренд и без бренда ВКЛ, конкуренты ВЫКЛ</w:t>
+            </w:r>
+          </w:p>
+        </w:tc>
+      </w:tr>
+      <w:tr>
+        <w:tc>
+          <w:tcPr>
+            <w:tcW w:type="dxa" w:w="2835"/>
+          </w:tcPr>
+          <w:p>
+            <w:r>
+              <w:t>Минус-фразы группы</w:t>
+            </w:r>
+          </w:p>
+        </w:tc>
+        <w:tc>
+          <w:tcPr>
+            <w:tcW w:type="dxa" w:w="7087"/>
+          </w:tcPr>
+          <w:p>
+            <w:r>
+              <w:t>Нет (минус-слова внутри фраз — кросс-минусовка)</w:t>
+            </w:r>
+          </w:p>
+        </w:tc>
+      </w:tr>
+      <w:tr>
+        <w:tc>
+          <w:tcPr>
+            <w:tcW w:type="dxa" w:w="2835"/>
+          </w:tcPr>
+          <w:p>
+            <w:r>
+              <w:t>Корректировки группы</w:t>
+            </w:r>
+          </w:p>
+        </w:tc>
+        <w:tc>
+          <w:tcPr>
+            <w:tcW w:type="dxa" w:w="7087"/>
+          </w:tcPr>
+          <w:p>
+            <w:r>
+              <w:t>Нет (действуют корректировки кампании)</w:t>
             </w:r>
           </w:p>
         </w:tc>
@@ -2052,35 +2096,75 @@
           <w:rFonts w:ascii="Consolas" w:hAnsi="Consolas"/>
           <w:sz w:val="19"/>
         </w:rPr>
-        <w:t>новый год в сочи</w:t>
+        <w:t>новый год 2027 сочи</w:t>
         <w:br/>
-        <w:t>новогодние каникулы в сочи</w:t>
+        <w:t>яхта сочи цена</w:t>
+        <w:br/>
+        <w:t>сочи на новогодние каникулы с детьми</w:t>
+        <w:br/>
+        <w:t>туры в сочи на новый год</w:t>
+        <w:br/>
+        <w:t>аренда яхты с капитаном сочи</w:t>
+        <w:br/>
+        <w:t>аренда яхты сочи -капитан</w:t>
+        <w:br/>
+        <w:t>морская прогулка сочи -зима</w:t>
+        <w:br/>
+        <w:t>отдых в сочи в январе 2027</w:t>
+        <w:br/>
+        <w:t>аренда яхты адлер</w:t>
+        <w:br/>
+        <w:t>прогулка на яхте сочи</w:t>
+        <w:br/>
+        <w:t>прогулка на яхте адлер</w:t>
+        <w:br/>
+        <w:t>морская прогулка зимой сочи</w:t>
+        <w:br/>
+        <w:t>морская прогулка сириус</w:t>
+        <w:br/>
+        <w:t>отели сириуса на новый год</w:t>
+        <w:br/>
+        <w:t>аренда яхты сириус</w:t>
+        <w:br/>
+        <w:t>новогодние каникулы в сочи -ребенок</w:t>
+        <w:br/>
+        <w:t>развлечения в сочи зимой</w:t>
+        <w:br/>
+        <w:t>отели адлера на новый год</w:t>
+        <w:br/>
+        <w:t>отдых в адлере на новый год</w:t>
+        <w:br/>
+        <w:t>новогодние праздники в сочи</w:t>
+        <w:br/>
+        <w:t>новый год в сочи -отдых -тур -2027 -яхта</w:t>
+        <w:br/>
+        <w:t>что делать в сириусе зимой</w:t>
+        <w:br/>
+        <w:t>сириус новый год -отель</w:t>
+        <w:br/>
+        <w:t>аренда катера сириус</w:t>
+        <w:br/>
+        <w:t>куда поехать на новогодние каникулы</w:t>
+        <w:br/>
+        <w:t>что посмотреть в сочи зимой</w:t>
+        <w:br/>
+        <w:t>чем заняться в сочи зимой</w:t>
         <w:br/>
         <w:t>отдых в сочи на новый год</w:t>
         <w:br/>
-        <w:t>туры в сочи на новый год</w:t>
+        <w:t>имеретинский курорт новый год</w:t>
+        <w:br/>
+        <w:t>прогулка под парусом сочи</w:t>
         <w:br/>
         <w:t>сочи в январе</w:t>
         <w:br/>
-        <w:t>сириус новый год</w:t>
+        <w:t>куда сходить в сочи на новый год</w:t>
         <w:br/>
-        <w:t>отели сириуса на новый год</w:t>
+        <w:t>яхта на новый год сочи</w:t>
         <w:br/>
-        <w:t>имеретинский курорт новый год</w:t>
-        <w:br/>
-        <w:t>куда поехать на новогодние каникулы</w:t>
+        <w:t>прогулка на катере сочи</w:t>
         <w:br/>
         <w:t>отдых на море зимой в россии</w:t>
-        <w:br/>
-        <w:t>аренда яхты сочи</w:t>
-        <w:br/>
-        <w:t>аренда яхты сириус</w:t>
-        <w:br/>
-        <w:t>аренда катера сириус</w:t>
-        <w:br/>
-        <w:t>морская прогулка сочи</w:t>
-        <w:br/>
-        <w:t>прогулка на яхте адлер</w:t>
       </w:r>
     </w:p>
     <w:p>

</xml_diff>

<commit_message>
EPK /yachts_ny: G1 ad copy from cabinet with fixes
Co-authored-by: Igor-Lark <Igor-Lark@users.noreply.github.com>
</commit_message>
<xml_diff>
--- a/reklama/EPK_yachts_ny_NG2027_zima.docx
+++ b/reklama/EPK_yachts_ny_NG2027_zima.docx
@@ -2259,7 +2259,7 @@
           </w:tcPr>
           <w:p>
             <w:r>
-              <w:t>Яхта на новогодние каникулы в Сириусе</w:t>
+              <w:t>Яхта на новогодние каникулы 2027 в Сириусе</w:t>
             </w:r>
           </w:p>
         </w:tc>
@@ -2269,7 +2269,7 @@
           </w:tcPr>
           <w:p>
             <w:r>
-              <w:t>37</w:t>
+              <w:t>42</w:t>
             </w:r>
           </w:p>
         </w:tc>
@@ -2291,7 +2291,7 @@
           </w:tcPr>
           <w:p>
             <w:r>
-              <w:t>Морская прогулка 1–10 января. Бронь без предоплаты</w:t>
+              <w:t>Морская прогулка на каникулах. Бронь без предоплаты</w:t>
             </w:r>
           </w:p>
         </w:tc>
@@ -2301,7 +2301,7 @@
           </w:tcPr>
           <w:p>
             <w:r>
-              <w:t>50</w:t>
+              <w:t>51</w:t>
             </w:r>
           </w:p>
         </w:tc>
@@ -2323,7 +2323,7 @@
           </w:tcPr>
           <w:p>
             <w:r>
-              <w:t>Новый год у моря: яхта или катер в Сириусе</w:t>
+              <w:t>Новый год у моря: парусная яхта или катер в Сириусе</w:t>
             </w:r>
           </w:p>
         </w:tc>
@@ -2333,7 +2333,7 @@
           </w:tcPr>
           <w:p>
             <w:r>
-              <w:t>42</w:t>
+              <w:t>51</w:t>
             </w:r>
           </w:p>
         </w:tc>
@@ -2387,7 +2387,7 @@
           </w:tcPr>
           <w:p>
             <w:r>
-              <w:t>Яхта целиком от 8 000 ₽/час. Имеретинский порт</w:t>
+              <w:t>Прогулка на парусной яхте с видом на снежные горы</w:t>
             </w:r>
           </w:p>
         </w:tc>
@@ -2397,7 +2397,7 @@
           </w:tcPr>
           <w:p>
             <w:r>
-              <w:t>46</w:t>
+              <w:t>49</w:t>
             </w:r>
           </w:p>
         </w:tc>
@@ -2419,7 +2419,7 @@
           </w:tcPr>
           <w:p>
             <w:r>
-              <w:t>Прогулка на яхте с видом на снежные горы</w:t>
+              <w:t>Сириус зимой: море и горы — вид с яхты</w:t>
             </w:r>
           </w:p>
         </w:tc>
@@ -2429,7 +2429,7 @@
           </w:tcPr>
           <w:p>
             <w:r>
-              <w:t>40</w:t>
+              <w:t>38</w:t>
             </w:r>
           </w:p>
         </w:tc>
@@ -2451,7 +2451,7 @@
           </w:tcPr>
           <w:p>
             <w:r>
-              <w:t>Сириус зимой: море, горы и яхта только ваша</w:t>
+              <w:t>Яхта целиком от 8 000 ₽/час — без праздничной наценки</w:t>
             </w:r>
           </w:p>
         </w:tc>
@@ -2461,7 +2461,7 @@
           </w:tcPr>
           <w:p>
             <w:r>
-              <w:t>43</w:t>
+              <w:t>53</w:t>
             </w:r>
           </w:p>
         </w:tc>
@@ -2552,7 +2552,7 @@
           </w:tcPr>
           <w:p>
             <w:r>
-              <w:t>Катер «Сириус» и яхта «Бруно». Бронь на 1–10 января без предоплаты.</w:t>
+              <w:t>Катер «Сириус», яхта «Бруно», парусник — бронь на 1–10 января без предоплаты.</w:t>
             </w:r>
           </w:p>
         </w:tc>
@@ -2562,7 +2562,7 @@
           </w:tcPr>
           <w:p>
             <w:r>
-              <w:t>67</w:t>
+              <w:t>77</w:t>
             </w:r>
           </w:p>
         </w:tc>
@@ -2584,7 +2584,7 @@
           </w:tcPr>
           <w:p>
             <w:r>
-              <w:t>Цена за всё судно, без праздничной наценки. Выход подтверждаем по погоде.</w:t>
+              <w:t>Аренда яхты в Сириусе на новогодние каникулы с 1 по 10 января. Бронируйте заранее</w:t>
             </w:r>
           </w:p>
         </w:tc>
@@ -2594,7 +2594,7 @@
           </w:tcPr>
           <w:p>
             <w:r>
-              <w:t>73</w:t>
+              <w:t>81</w:t>
             </w:r>
           </w:p>
         </w:tc>
@@ -2616,7 +2616,7 @@
           </w:tcPr>
           <w:p>
             <w:r>
-              <w:t>Имеретинский порт, линия 1. Капитан на борту, маршрут обсудим с вами.</w:t>
+              <w:t>Планируете Новый год в Сочи? Добавьте в поездку прогулку на яхте в Сириусе.</w:t>
             </w:r>
           </w:p>
         </w:tc>
@@ -2626,7 +2626,7 @@
           </w:tcPr>
           <w:p>
             <w:r>
-              <w:t>69</w:t>
+              <w:t>75</w:t>
             </w:r>
           </w:p>
         </w:tc>
@@ -2639,7 +2639,7 @@
           <w:b w:val="0"/>
           <w:i w:val="0"/>
         </w:rPr>
-        <w:t>Ссылка: https://boat-sochi.ru/yachts_ny?utm_source=yandex&amp;utm_medium=cpc&amp;utm_campaign=epk_yachts_ny&amp;utm_content=G1_{ad_id}&amp;utm_term={keyword}&amp;site={source}</w:t>
+        <w:t>Ссылка: https://boat-sochi.ru/yachts_ny · отображаемая ссылка: boat-sochi.ru/2027-на-яхте · параметры URL: utm_source=yandex&amp;utm_medium=cpc&amp;utm_campaign=epk_yachts_ny&amp;utm_content=G1_{ad_id}&amp;utm_term={keyword}&amp;site={source}</w:t>
       </w:r>
     </w:p>
     <w:p>

</xml_diff>